<commit_message>
docs(forecasting): document approved moving-average migration
Define the fixed four-quarter window, setup/import coverage policy,
and product-only administrator workflow.

Record revised issue responsibilities, trend retirement, and source
precedence while distinguishing existing code from pending migration.
</commit_message>
<xml_diff>
--- a/docs/capstone_manuscript.docx
+++ b/docs/capstone_manuscript.docx
@@ -1656,7 +1656,7 @@
           <w:sz w:val="24"/>
           <w:szCs w:val="24"/>
         </w:rPr>
-        <w:t xml:space="preserve">In addition, a predictive analytics module will analyze historical sales and inventory data from Battlefront Computer Trading to forecast product demand and identify sales trends to support inventory planning and business decision-making. An integrated chatbot module will also be provided to handle product inquiries, order status inquiries, store information requests, and frequently asked questions through automated conversational interaction. </w:t>
+        <w:t xml:space="preserve">In addition, a predictive analytics module will use a trailing four-quarter simple moving average of Battlefront Computer Trading's covered historical unit sales to estimate product demand for quarterly inventory planning. Current inventory will be shown separately as planning context, and historical sales observations will support review of sales patterns. An integrated chatbot module will also be provided to handle product inquiries, order status inquiries, store information requests, and frequently asked questions through automated conversational interaction. </w:t>
       </w:r>
     </w:p>
     <w:p>
@@ -1704,6 +1704,7 @@
           <w:sz w:val="24"/>
           <w:szCs w:val="24"/>
         </w:rPr>
+        <w:lastRenderedPageBreak/>
         <w:t>The proposed system is subject to the following limitations:</w:t>
       </w:r>
     </w:p>
@@ -1723,9 +1724,162 @@
           <w:sz w:val="24"/>
           <w:szCs w:val="24"/>
         </w:rPr>
+        <w:t xml:space="preserve">The product recommendation module relies on the product catalog and inventory data available within the system and does not retrieve real-time pricing or availability from external supplier databases or competitor markets. The predictive analytics and sales forecasting functions use only covered historical unit sales provided by Battlefront Computer Trading, with current inventory as separate planning context, and do not incorporate external market trends, seasonal economic factors, or supplier-side disruptions. The four-quarter moving average is a decision-support baseline; it does not estimate unrecorded demand or stockout losses. The chatbot operates within a predefined knowledge base and natural language scope limited to product inquiries, order tracking, store details, and frequently asked questions; it does not support open-domain conversations, complex complaint resolution, or product recommendations, which are handled by the Product Recommendation Module. The mobile application is primarily designed for customer-facing e-commerce functions, while administrative functions requiring complex data entry, bulk inventory uploads, and detailed report generation are optimized for the web-based platform. The study is limited to Battlefront Computer Trading, with primary requirements gathering, testing, and evaluation conducted at the Sagay City branch; branch-specific operational customization and multi-branch inventory synchronization are beyond the scope of the study. Real-time online payment gateway integration and automated payment verification, including credit card processing and third-party e-wallet services, are also beyond the scope of the study, with the system supporting </w:t>
+      </w:r>
+      <w:r>
+        <w:rPr>
+          <w:rFonts w:ascii="Times New Roman" w:eastAsia="Times New Roman" w:hAnsi="Times New Roman" w:cs="Times New Roman"/>
+          <w:sz w:val="24"/>
+          <w:szCs w:val="24"/>
+        </w:rPr>
         <w:lastRenderedPageBreak/>
-        <w:t xml:space="preserve">The product recommendation module relies on the product catalog and inventory data available within the system and does not retrieve real-time pricing or availability from external supplier databases or competitor markets. The predictive analytics and sales forecasting functions are based solely on the historical transaction and inventory data provided by Battlefront Computer Trading and do not incorporate external market trends, seasonal economic factors, or supplier-side disruptions. The chatbot operates within a predefined knowledge base and natural language scope limited to product inquiries, order tracking, store details, and frequently asked questions; it does not support open-domain conversations, complex complaint resolution, or product recommendations, which are handled by the Product Recommendation Module. The mobile application is primarily designed for customer-facing e-commerce functions, while administrative functions requiring complex data entry, bulk inventory uploads, and detailed report generation are optimized for the web-based platform. The study is limited to Battlefront Computer Trading, with primary requirements gathering, testing, and evaluation conducted at the Sagay City branch; branch-specific operational customization and multi-branch inventory synchronization are beyond the scope of the study. Real-time online payment gateway integration and automated payment verification, including credit card processing and third-party e-wallet services, are also beyond the scope of the study, with the system supporting payment method selection and manual payment verification procedures determined by Battlefront Computer Trading. Finally, while the system supports order placement, order monitoring, and order status tracking, logistics </w:t>
-      </w:r>
+        <w:t>payment method selection and manual payment verification procedures determined by Battlefront Computer Trading. Finally, while the system supports order placement, order monitoring, and order status tracking, logistics management, courier integration, route optimization, and real-time delivery tracking remain outside the scope of the study and will continue to depend on the business's existing delivery processes.</w:t>
+      </w:r>
+    </w:p>
+    <w:p>
+      <w:pPr>
+        <w:spacing w:line="480" w:lineRule="auto"/>
+        <w:rPr>
+          <w:rFonts w:ascii="Times New Roman" w:eastAsia="Times New Roman" w:hAnsi="Times New Roman" w:cs="Times New Roman"/>
+          <w:sz w:val="24"/>
+          <w:szCs w:val="24"/>
+        </w:rPr>
+      </w:pPr>
+    </w:p>
+    <w:p>
+      <w:pPr>
+        <w:spacing w:line="480" w:lineRule="auto"/>
+        <w:rPr>
+          <w:rFonts w:ascii="Times New Roman" w:eastAsia="Times New Roman" w:hAnsi="Times New Roman" w:cs="Times New Roman"/>
+          <w:b/>
+          <w:sz w:val="24"/>
+          <w:szCs w:val="24"/>
+        </w:rPr>
+      </w:pPr>
+    </w:p>
+    <w:p>
+      <w:pPr>
+        <w:spacing w:line="480" w:lineRule="auto"/>
+        <w:rPr>
+          <w:rFonts w:ascii="Times New Roman" w:eastAsia="Times New Roman" w:hAnsi="Times New Roman" w:cs="Times New Roman"/>
+          <w:b/>
+          <w:sz w:val="24"/>
+          <w:szCs w:val="24"/>
+        </w:rPr>
+      </w:pPr>
+    </w:p>
+    <w:p>
+      <w:pPr>
+        <w:spacing w:line="480" w:lineRule="auto"/>
+        <w:rPr>
+          <w:rFonts w:ascii="Times New Roman" w:eastAsia="Times New Roman" w:hAnsi="Times New Roman" w:cs="Times New Roman"/>
+          <w:b/>
+          <w:sz w:val="24"/>
+          <w:szCs w:val="24"/>
+        </w:rPr>
+      </w:pPr>
+      <w:r>
+        <w:rPr>
+          <w:rFonts w:ascii="Times New Roman" w:eastAsia="Times New Roman" w:hAnsi="Times New Roman" w:cs="Times New Roman"/>
+          <w:b/>
+          <w:sz w:val="24"/>
+          <w:szCs w:val="24"/>
+        </w:rPr>
+        <w:t>Significance of the Study</w:t>
+      </w:r>
+    </w:p>
+    <w:p>
+      <w:pPr>
+        <w:spacing w:line="480" w:lineRule="auto"/>
+        <w:ind w:firstLine="720"/>
+        <w:rPr>
+          <w:rFonts w:ascii="Times New Roman" w:eastAsia="Times New Roman" w:hAnsi="Times New Roman" w:cs="Times New Roman"/>
+          <w:sz w:val="24"/>
+          <w:szCs w:val="24"/>
+        </w:rPr>
+      </w:pPr>
+      <w:r>
+        <w:rPr>
+          <w:rFonts w:ascii="Times New Roman" w:eastAsia="Times New Roman" w:hAnsi="Times New Roman" w:cs="Times New Roman"/>
+          <w:sz w:val="24"/>
+          <w:szCs w:val="24"/>
+        </w:rPr>
+        <w:t>The development of an Integrated Web and Mobile Business Management System with Product Recommendation, Predictive Analytics, and Integrated Chatbot for Battlefront Computer Trading is significant as it contributes to improved retail operations, customer experience, and the advancement of intelligent business systems for small and medium enterprises. The following stakeholders are expected to benefit from this study:</w:t>
+      </w:r>
+    </w:p>
+    <w:p>
+      <w:pPr>
+        <w:spacing w:line="480" w:lineRule="auto"/>
+        <w:rPr>
+          <w:rFonts w:ascii="Times New Roman" w:eastAsia="Times New Roman" w:hAnsi="Times New Roman" w:cs="Times New Roman"/>
+          <w:b/>
+          <w:bCs/>
+          <w:sz w:val="24"/>
+          <w:szCs w:val="24"/>
+        </w:rPr>
+      </w:pPr>
+      <w:r>
+        <w:rPr>
+          <w:rFonts w:ascii="Times New Roman" w:eastAsia="Times New Roman" w:hAnsi="Times New Roman" w:cs="Times New Roman"/>
+          <w:b/>
+          <w:bCs/>
+          <w:sz w:val="24"/>
+          <w:szCs w:val="24"/>
+        </w:rPr>
+        <w:t>For Battlefront Computer Trading:</w:t>
+      </w:r>
+    </w:p>
+    <w:p>
+      <w:pPr>
+        <w:spacing w:line="480" w:lineRule="auto"/>
+        <w:ind w:firstLine="720"/>
+        <w:rPr>
+          <w:rFonts w:ascii="Times New Roman" w:eastAsia="Times New Roman" w:hAnsi="Times New Roman" w:cs="Times New Roman"/>
+          <w:sz w:val="24"/>
+          <w:szCs w:val="24"/>
+        </w:rPr>
+      </w:pPr>
+      <w:r>
+        <w:rPr>
+          <w:rFonts w:ascii="Times New Roman" w:eastAsia="Times New Roman" w:hAnsi="Times New Roman" w:cs="Times New Roman"/>
+          <w:sz w:val="24"/>
+          <w:szCs w:val="24"/>
+        </w:rPr>
+        <w:t>The system will serve as a decision-support tool that streamlines sales recording, inventory monitoring, and customer engagement. By providing accurate demand forecasts and automated customer assistance, the business can reduce stockouts, minimize manual workload, and improve overall customer satisfaction.</w:t>
+      </w:r>
+    </w:p>
+    <w:p>
+      <w:pPr>
+        <w:spacing w:line="480" w:lineRule="auto"/>
+        <w:rPr>
+          <w:rFonts w:ascii="Times New Roman" w:eastAsia="Times New Roman" w:hAnsi="Times New Roman" w:cs="Times New Roman"/>
+          <w:b/>
+          <w:bCs/>
+          <w:sz w:val="24"/>
+          <w:szCs w:val="24"/>
+        </w:rPr>
+      </w:pPr>
+      <w:r>
+        <w:rPr>
+          <w:rFonts w:ascii="Times New Roman" w:eastAsia="Times New Roman" w:hAnsi="Times New Roman" w:cs="Times New Roman"/>
+          <w:b/>
+          <w:bCs/>
+          <w:sz w:val="24"/>
+          <w:szCs w:val="24"/>
+        </w:rPr>
+        <w:t>For Customers:</w:t>
+      </w:r>
+    </w:p>
+    <w:p>
+      <w:pPr>
+        <w:spacing w:line="480" w:lineRule="auto"/>
+        <w:ind w:firstLine="720"/>
+        <w:rPr>
+          <w:rFonts w:ascii="Times New Roman" w:eastAsia="Times New Roman" w:hAnsi="Times New Roman" w:cs="Times New Roman"/>
+          <w:sz w:val="24"/>
+          <w:szCs w:val="24"/>
+        </w:rPr>
+      </w:pPr>
       <w:r>
         <w:rPr>
           <w:rFonts w:ascii="Times New Roman" w:eastAsia="Times New Roman" w:hAnsi="Times New Roman" w:cs="Times New Roman"/>
@@ -1733,78 +1887,7 @@
           <w:szCs w:val="24"/>
         </w:rPr>
         <w:lastRenderedPageBreak/>
-        <w:t>management, courier integration, route optimization, and real-time delivery tracking remain outside the scope of the study and will continue to depend on the business's existing delivery processes.</w:t>
-      </w:r>
-    </w:p>
-    <w:p>
-      <w:pPr>
-        <w:spacing w:line="480" w:lineRule="auto"/>
-        <w:rPr>
-          <w:rFonts w:ascii="Times New Roman" w:eastAsia="Times New Roman" w:hAnsi="Times New Roman" w:cs="Times New Roman"/>
-          <w:sz w:val="24"/>
-          <w:szCs w:val="24"/>
-        </w:rPr>
-      </w:pPr>
-    </w:p>
-    <w:p>
-      <w:pPr>
-        <w:spacing w:line="480" w:lineRule="auto"/>
-        <w:rPr>
-          <w:rFonts w:ascii="Times New Roman" w:eastAsia="Times New Roman" w:hAnsi="Times New Roman" w:cs="Times New Roman"/>
-          <w:b/>
-          <w:sz w:val="24"/>
-          <w:szCs w:val="24"/>
-        </w:rPr>
-      </w:pPr>
-    </w:p>
-    <w:p>
-      <w:pPr>
-        <w:spacing w:line="480" w:lineRule="auto"/>
-        <w:rPr>
-          <w:rFonts w:ascii="Times New Roman" w:eastAsia="Times New Roman" w:hAnsi="Times New Roman" w:cs="Times New Roman"/>
-          <w:b/>
-          <w:sz w:val="24"/>
-          <w:szCs w:val="24"/>
-        </w:rPr>
-      </w:pPr>
-    </w:p>
-    <w:p>
-      <w:pPr>
-        <w:spacing w:line="480" w:lineRule="auto"/>
-        <w:rPr>
-          <w:rFonts w:ascii="Times New Roman" w:eastAsia="Times New Roman" w:hAnsi="Times New Roman" w:cs="Times New Roman"/>
-          <w:b/>
-          <w:sz w:val="24"/>
-          <w:szCs w:val="24"/>
-        </w:rPr>
-      </w:pPr>
-      <w:r>
-        <w:rPr>
-          <w:rFonts w:ascii="Times New Roman" w:eastAsia="Times New Roman" w:hAnsi="Times New Roman" w:cs="Times New Roman"/>
-          <w:b/>
-          <w:sz w:val="24"/>
-          <w:szCs w:val="24"/>
-        </w:rPr>
-        <w:t>Significance of the Study</w:t>
-      </w:r>
-    </w:p>
-    <w:p>
-      <w:pPr>
-        <w:spacing w:line="480" w:lineRule="auto"/>
-        <w:ind w:firstLine="720"/>
-        <w:rPr>
-          <w:rFonts w:ascii="Times New Roman" w:eastAsia="Times New Roman" w:hAnsi="Times New Roman" w:cs="Times New Roman"/>
-          <w:sz w:val="24"/>
-          <w:szCs w:val="24"/>
-        </w:rPr>
-      </w:pPr>
-      <w:r>
-        <w:rPr>
-          <w:rFonts w:ascii="Times New Roman" w:eastAsia="Times New Roman" w:hAnsi="Times New Roman" w:cs="Times New Roman"/>
-          <w:sz w:val="24"/>
-          <w:szCs w:val="24"/>
-        </w:rPr>
-        <w:t>The development of an Integrated Web and Mobile Business Management System with Product Recommendation, Predictive Analytics, and Integrated Chatbot for Battlefront Computer Trading is significant as it contributes to improved retail operations, customer experience, and the advancement of intelligent business systems for small and medium enterprises. The following stakeholders are expected to benefit from this study:</w:t>
+        <w:t>Customers gain access to a more convenient shopping experience through personalized product recommendations, an accessible chatbot for immediate inquiries, and real-time information on product availability, whether browsing in-store or through the web and mobile platforms.</w:t>
       </w:r>
     </w:p>
     <w:p>
@@ -1826,26 +1909,26 @@
           <w:sz w:val="24"/>
           <w:szCs w:val="24"/>
         </w:rPr>
-        <w:t>For Battlefront Computer Trading:</w:t>
-      </w:r>
-    </w:p>
-    <w:p>
-      <w:pPr>
-        <w:spacing w:line="480" w:lineRule="auto"/>
-        <w:ind w:firstLine="720"/>
-        <w:rPr>
-          <w:rFonts w:ascii="Times New Roman" w:eastAsia="Times New Roman" w:hAnsi="Times New Roman" w:cs="Times New Roman"/>
-          <w:sz w:val="24"/>
-          <w:szCs w:val="24"/>
-        </w:rPr>
-      </w:pPr>
-      <w:r>
-        <w:rPr>
-          <w:rFonts w:ascii="Times New Roman" w:eastAsia="Times New Roman" w:hAnsi="Times New Roman" w:cs="Times New Roman"/>
-          <w:sz w:val="24"/>
-          <w:szCs w:val="24"/>
-        </w:rPr>
-        <w:t>The system will serve as a decision-support tool that streamlines sales recording, inventory monitoring, and customer engagement. By providing accurate demand forecasts and automated customer assistance, the business can reduce stockouts, minimize manual workload, and improve overall customer satisfaction.</w:t>
+        <w:t>For the Academic Institution:</w:t>
+      </w:r>
+    </w:p>
+    <w:p>
+      <w:pPr>
+        <w:spacing w:line="480" w:lineRule="auto"/>
+        <w:ind w:firstLine="720"/>
+        <w:rPr>
+          <w:rFonts w:ascii="Times New Roman" w:eastAsia="Times New Roman" w:hAnsi="Times New Roman" w:cs="Times New Roman"/>
+          <w:sz w:val="24"/>
+          <w:szCs w:val="24"/>
+        </w:rPr>
+      </w:pPr>
+      <w:r>
+        <w:rPr>
+          <w:rFonts w:ascii="Times New Roman" w:eastAsia="Times New Roman" w:hAnsi="Times New Roman" w:cs="Times New Roman"/>
+          <w:sz w:val="24"/>
+          <w:szCs w:val="24"/>
+        </w:rPr>
+        <w:t>The project serves as a reference for integrating information systems, recommendation techniques, and conversational interfaces into a real-world retail application. It also provides future capstone project groups with a benchmark for developing similarly integrated business systems.</w:t>
       </w:r>
     </w:p>
     <w:p>
@@ -1859,7 +1942,10 @@
           <w:szCs w:val="24"/>
         </w:rPr>
       </w:pPr>
-      <w:r>
+    </w:p>
+    <w:p>
+      <w:pPr>
+        <w:spacing w:line="480" w:lineRule="auto"/>
         <w:rPr>
           <w:rFonts w:ascii="Times New Roman" w:eastAsia="Times New Roman" w:hAnsi="Times New Roman" w:cs="Times New Roman"/>
           <w:b/>
@@ -1867,31 +1953,8 @@
           <w:sz w:val="24"/>
           <w:szCs w:val="24"/>
         </w:rPr>
-        <w:t>For Customers:</w:t>
-      </w:r>
-    </w:p>
-    <w:p>
-      <w:pPr>
-        <w:spacing w:line="480" w:lineRule="auto"/>
-        <w:ind w:firstLine="720"/>
-        <w:rPr>
-          <w:rFonts w:ascii="Times New Roman" w:eastAsia="Times New Roman" w:hAnsi="Times New Roman" w:cs="Times New Roman"/>
-          <w:sz w:val="24"/>
-          <w:szCs w:val="24"/>
-        </w:rPr>
-      </w:pPr>
-      <w:r>
-        <w:rPr>
-          <w:rFonts w:ascii="Times New Roman" w:eastAsia="Times New Roman" w:hAnsi="Times New Roman" w:cs="Times New Roman"/>
-          <w:sz w:val="24"/>
-          <w:szCs w:val="24"/>
-        </w:rPr>
-        <w:t>Customers gain access to a more convenient shopping experience through personalized product recommendations, an accessible chatbot for immediate inquiries, and real-time information on product availability, whether browsing in-store or through the web and mobile platforms.</w:t>
-      </w:r>
-    </w:p>
-    <w:p>
-      <w:pPr>
-        <w:spacing w:line="480" w:lineRule="auto"/>
+      </w:pPr>
+      <w:r>
         <w:rPr>
           <w:rFonts w:ascii="Times New Roman" w:eastAsia="Times New Roman" w:hAnsi="Times New Roman" w:cs="Times New Roman"/>
           <w:b/>
@@ -1899,8 +1962,31 @@
           <w:sz w:val="24"/>
           <w:szCs w:val="24"/>
         </w:rPr>
-      </w:pPr>
-      <w:r>
+        <w:t>For Future Researchers:</w:t>
+      </w:r>
+    </w:p>
+    <w:p>
+      <w:pPr>
+        <w:spacing w:line="480" w:lineRule="auto"/>
+        <w:ind w:firstLine="720"/>
+        <w:rPr>
+          <w:rFonts w:ascii="Times New Roman" w:eastAsia="Times New Roman" w:hAnsi="Times New Roman" w:cs="Times New Roman"/>
+          <w:sz w:val="24"/>
+          <w:szCs w:val="24"/>
+        </w:rPr>
+      </w:pPr>
+      <w:r>
+        <w:rPr>
+          <w:rFonts w:ascii="Times New Roman" w:eastAsia="Times New Roman" w:hAnsi="Times New Roman" w:cs="Times New Roman"/>
+          <w:sz w:val="24"/>
+          <w:szCs w:val="24"/>
+        </w:rPr>
+        <w:t>This study contributes to the growing body of knowledge on integrating recommendation systems, predictive analytics, and chatbots into small business management platforms, particularly within the Philippine MSME context. Future researchers may use this as a reference for expanding such systems with additional features, such as more advanced machine learning models or omnichannel integration.</w:t>
+      </w:r>
+    </w:p>
+    <w:p>
+      <w:pPr>
+        <w:spacing w:line="480" w:lineRule="auto"/>
         <w:rPr>
           <w:rFonts w:ascii="Times New Roman" w:eastAsia="Times New Roman" w:hAnsi="Times New Roman" w:cs="Times New Roman"/>
           <w:b/>
@@ -1908,191 +1994,105 @@
           <w:sz w:val="24"/>
           <w:szCs w:val="24"/>
         </w:rPr>
+      </w:pPr>
+      <w:r>
+        <w:rPr>
+          <w:rFonts w:ascii="Times New Roman" w:eastAsia="Times New Roman" w:hAnsi="Times New Roman" w:cs="Times New Roman"/>
+          <w:b/>
+          <w:bCs/>
+          <w:sz w:val="24"/>
+          <w:szCs w:val="24"/>
+        </w:rPr>
+        <w:t>For the Researchers:</w:t>
+      </w:r>
+    </w:p>
+    <w:p>
+      <w:pPr>
+        <w:spacing w:line="480" w:lineRule="auto"/>
+        <w:ind w:firstLine="720"/>
+        <w:rPr>
+          <w:rFonts w:ascii="Times New Roman" w:eastAsia="Times New Roman" w:hAnsi="Times New Roman" w:cs="Times New Roman"/>
+          <w:sz w:val="24"/>
+          <w:szCs w:val="24"/>
+        </w:rPr>
+      </w:pPr>
+      <w:r>
+        <w:rPr>
+          <w:rFonts w:ascii="Times New Roman" w:eastAsia="Times New Roman" w:hAnsi="Times New Roman" w:cs="Times New Roman"/>
+          <w:sz w:val="24"/>
+          <w:szCs w:val="24"/>
+        </w:rPr>
+        <w:t>The project enables the proponents to apply theoretical knowledge in software development, data analytics, and human-computer interaction to address a real-world business challenge. It also enhances their competencies in systems design, research, and critical thinking, preparing them for professional careers in information technology.</w:t>
+      </w:r>
+    </w:p>
+    <w:p>
+      <w:pPr>
+        <w:spacing w:line="480" w:lineRule="auto"/>
+        <w:ind w:firstLine="720"/>
+        <w:rPr>
+          <w:rFonts w:ascii="Times New Roman" w:eastAsia="Times New Roman" w:hAnsi="Times New Roman" w:cs="Times New Roman"/>
+          <w:sz w:val="24"/>
+          <w:szCs w:val="24"/>
+        </w:rPr>
+      </w:pPr>
+    </w:p>
+    <w:p>
+      <w:pPr>
+        <w:spacing w:before="240" w:after="240" w:line="480" w:lineRule="auto"/>
+        <w:rPr>
+          <w:rFonts w:ascii="Times New Roman" w:eastAsia="Times New Roman" w:hAnsi="Times New Roman" w:cs="Times New Roman"/>
+          <w:b/>
+          <w:sz w:val="24"/>
+          <w:szCs w:val="24"/>
+        </w:rPr>
+      </w:pPr>
+      <w:r>
+        <w:rPr>
+          <w:rFonts w:ascii="Times New Roman" w:eastAsia="Times New Roman" w:hAnsi="Times New Roman" w:cs="Times New Roman"/>
+          <w:b/>
+          <w:sz w:val="24"/>
+          <w:szCs w:val="24"/>
+        </w:rPr>
         <w:lastRenderedPageBreak/>
-        <w:t>For the Academic Institution:</w:t>
-      </w:r>
-    </w:p>
-    <w:p>
-      <w:pPr>
-        <w:spacing w:line="480" w:lineRule="auto"/>
-        <w:ind w:firstLine="720"/>
-        <w:rPr>
-          <w:rFonts w:ascii="Times New Roman" w:eastAsia="Times New Roman" w:hAnsi="Times New Roman" w:cs="Times New Roman"/>
-          <w:sz w:val="24"/>
-          <w:szCs w:val="24"/>
-        </w:rPr>
-      </w:pPr>
-      <w:r>
-        <w:rPr>
-          <w:rFonts w:ascii="Times New Roman" w:eastAsia="Times New Roman" w:hAnsi="Times New Roman" w:cs="Times New Roman"/>
-          <w:sz w:val="24"/>
-          <w:szCs w:val="24"/>
-        </w:rPr>
-        <w:t>The project serves as a reference for integrating information systems, recommendation techniques, and conversational interfaces into a real-world retail application. It also provides future capstone project groups with a benchmark for developing similarly integrated business systems.</w:t>
-      </w:r>
-    </w:p>
-    <w:p>
-      <w:pPr>
-        <w:spacing w:line="480" w:lineRule="auto"/>
-        <w:rPr>
-          <w:rFonts w:ascii="Times New Roman" w:eastAsia="Times New Roman" w:hAnsi="Times New Roman" w:cs="Times New Roman"/>
-          <w:b/>
-          <w:bCs/>
-          <w:sz w:val="24"/>
-          <w:szCs w:val="24"/>
-        </w:rPr>
-      </w:pPr>
-    </w:p>
-    <w:p>
-      <w:pPr>
-        <w:spacing w:line="480" w:lineRule="auto"/>
-        <w:rPr>
-          <w:rFonts w:ascii="Times New Roman" w:eastAsia="Times New Roman" w:hAnsi="Times New Roman" w:cs="Times New Roman"/>
-          <w:b/>
-          <w:bCs/>
-          <w:sz w:val="24"/>
-          <w:szCs w:val="24"/>
-        </w:rPr>
-      </w:pPr>
-      <w:r>
-        <w:rPr>
-          <w:rFonts w:ascii="Times New Roman" w:eastAsia="Times New Roman" w:hAnsi="Times New Roman" w:cs="Times New Roman"/>
-          <w:b/>
-          <w:bCs/>
-          <w:sz w:val="24"/>
-          <w:szCs w:val="24"/>
-        </w:rPr>
-        <w:t>For Future Researchers:</w:t>
-      </w:r>
-    </w:p>
-    <w:p>
-      <w:pPr>
-        <w:spacing w:line="480" w:lineRule="auto"/>
-        <w:ind w:firstLine="720"/>
-        <w:rPr>
-          <w:rFonts w:ascii="Times New Roman" w:eastAsia="Times New Roman" w:hAnsi="Times New Roman" w:cs="Times New Roman"/>
-          <w:sz w:val="24"/>
-          <w:szCs w:val="24"/>
-        </w:rPr>
-      </w:pPr>
-      <w:r>
-        <w:rPr>
-          <w:rFonts w:ascii="Times New Roman" w:eastAsia="Times New Roman" w:hAnsi="Times New Roman" w:cs="Times New Roman"/>
-          <w:sz w:val="24"/>
-          <w:szCs w:val="24"/>
-        </w:rPr>
-        <w:t>This study contributes to the growing body of knowledge on integrating recommendation systems, predictive analytics, and chatbots into small business management platforms, particularly within the Philippine MSME context. Future researchers may use this as a reference for expanding such systems with additional features, such as more advanced machine learning models or omnichannel integration.</w:t>
-      </w:r>
-    </w:p>
-    <w:p>
-      <w:pPr>
-        <w:spacing w:line="480" w:lineRule="auto"/>
-        <w:rPr>
-          <w:rFonts w:ascii="Times New Roman" w:eastAsia="Times New Roman" w:hAnsi="Times New Roman" w:cs="Times New Roman"/>
-          <w:b/>
-          <w:bCs/>
-          <w:sz w:val="24"/>
-          <w:szCs w:val="24"/>
-        </w:rPr>
-      </w:pPr>
-      <w:r>
-        <w:rPr>
-          <w:rFonts w:ascii="Times New Roman" w:eastAsia="Times New Roman" w:hAnsi="Times New Roman" w:cs="Times New Roman"/>
-          <w:b/>
-          <w:bCs/>
-          <w:sz w:val="24"/>
-          <w:szCs w:val="24"/>
-        </w:rPr>
-        <w:t>For the Researchers:</w:t>
-      </w:r>
-    </w:p>
-    <w:p>
-      <w:pPr>
-        <w:spacing w:line="480" w:lineRule="auto"/>
-        <w:ind w:firstLine="720"/>
-        <w:rPr>
-          <w:rFonts w:ascii="Times New Roman" w:eastAsia="Times New Roman" w:hAnsi="Times New Roman" w:cs="Times New Roman"/>
-          <w:sz w:val="24"/>
-          <w:szCs w:val="24"/>
-        </w:rPr>
-      </w:pPr>
-      <w:r>
-        <w:rPr>
-          <w:rFonts w:ascii="Times New Roman" w:eastAsia="Times New Roman" w:hAnsi="Times New Roman" w:cs="Times New Roman"/>
-          <w:sz w:val="24"/>
-          <w:szCs w:val="24"/>
-        </w:rPr>
-        <w:t>The project enables the proponents to apply theoretical knowledge in software development, data analytics, and human-computer interaction to address a real-world business challenge. It also enhances their competencies in systems design, research, and critical thinking, preparing them for professional careers in information technology.</w:t>
-      </w:r>
-    </w:p>
-    <w:p>
-      <w:pPr>
-        <w:spacing w:line="480" w:lineRule="auto"/>
-        <w:ind w:firstLine="720"/>
-        <w:rPr>
-          <w:rFonts w:ascii="Times New Roman" w:eastAsia="Times New Roman" w:hAnsi="Times New Roman" w:cs="Times New Roman"/>
-          <w:sz w:val="24"/>
-          <w:szCs w:val="24"/>
-        </w:rPr>
-      </w:pPr>
+        <w:t>Definition of Terms</w:t>
+      </w:r>
     </w:p>
     <w:p>
       <w:pPr>
         <w:spacing w:before="240" w:after="240" w:line="480" w:lineRule="auto"/>
         <w:rPr>
           <w:rFonts w:ascii="Times New Roman" w:eastAsia="Times New Roman" w:hAnsi="Times New Roman" w:cs="Times New Roman"/>
-          <w:b/>
-          <w:sz w:val="24"/>
-          <w:szCs w:val="24"/>
-        </w:rPr>
-      </w:pPr>
-      <w:r>
-        <w:rPr>
-          <w:rFonts w:ascii="Times New Roman" w:eastAsia="Times New Roman" w:hAnsi="Times New Roman" w:cs="Times New Roman"/>
-          <w:b/>
-          <w:sz w:val="24"/>
-          <w:szCs w:val="24"/>
-        </w:rPr>
-        <w:t>Definition of Terms</w:t>
+          <w:sz w:val="24"/>
+          <w:szCs w:val="24"/>
+        </w:rPr>
+      </w:pPr>
+      <w:r>
+        <w:rPr>
+          <w:rFonts w:ascii="Times New Roman" w:eastAsia="Times New Roman" w:hAnsi="Times New Roman" w:cs="Times New Roman"/>
+          <w:sz w:val="24"/>
+          <w:szCs w:val="24"/>
+        </w:rPr>
+        <w:t>To provide clarity and common understanding, the following key terms are defined as used in this study:</w:t>
       </w:r>
     </w:p>
     <w:p>
       <w:pPr>
         <w:spacing w:before="240" w:after="240" w:line="480" w:lineRule="auto"/>
-        <w:rPr>
-          <w:rFonts w:ascii="Times New Roman" w:eastAsia="Times New Roman" w:hAnsi="Times New Roman" w:cs="Times New Roman"/>
-          <w:sz w:val="24"/>
-          <w:szCs w:val="24"/>
-        </w:rPr>
-      </w:pPr>
-      <w:r>
-        <w:rPr>
-          <w:rFonts w:ascii="Times New Roman" w:eastAsia="Times New Roman" w:hAnsi="Times New Roman" w:cs="Times New Roman"/>
-          <w:sz w:val="24"/>
-          <w:szCs w:val="24"/>
-        </w:rPr>
-        <w:t>To provide clarity and common understanding, the following key terms are defined as used in this study:</w:t>
-      </w:r>
-    </w:p>
-    <w:p>
-      <w:pPr>
-        <w:spacing w:before="240" w:after="240" w:line="480" w:lineRule="auto"/>
-        <w:ind w:firstLine="720"/>
-        <w:rPr>
-          <w:rFonts w:ascii="Times New Roman" w:eastAsia="Times New Roman" w:hAnsi="Times New Roman" w:cs="Times New Roman"/>
-          <w:b/>
-          <w:sz w:val="24"/>
-          <w:szCs w:val="24"/>
-        </w:rPr>
-      </w:pPr>
-      <w:r>
-        <w:rPr>
-          <w:rFonts w:ascii="Times New Roman" w:eastAsia="Times New Roman" w:hAnsi="Times New Roman" w:cs="Times New Roman"/>
-          <w:b/>
-          <w:sz w:val="24"/>
-          <w:szCs w:val="24"/>
-        </w:rPr>
-        <w:lastRenderedPageBreak/>
+        <w:ind w:firstLine="720"/>
+        <w:rPr>
+          <w:rFonts w:ascii="Times New Roman" w:eastAsia="Times New Roman" w:hAnsi="Times New Roman" w:cs="Times New Roman"/>
+          <w:b/>
+          <w:sz w:val="24"/>
+          <w:szCs w:val="24"/>
+        </w:rPr>
+      </w:pPr>
+      <w:r>
+        <w:rPr>
+          <w:rFonts w:ascii="Times New Roman" w:eastAsia="Times New Roman" w:hAnsi="Times New Roman" w:cs="Times New Roman"/>
+          <w:b/>
+          <w:sz w:val="24"/>
+          <w:szCs w:val="24"/>
+        </w:rPr>
         <w:t>Chatbot</w:t>
       </w:r>
     </w:p>
@@ -2230,6 +2230,7 @@
           <w:sz w:val="24"/>
           <w:szCs w:val="24"/>
         </w:rPr>
+        <w:lastRenderedPageBreak/>
         <w:t>Operational:</w:t>
       </w:r>
       <w:r>
@@ -2238,16 +2239,7 @@
           <w:sz w:val="24"/>
           <w:szCs w:val="24"/>
         </w:rPr>
-        <w:t xml:space="preserve"> In this study, it refers to the customer-facing digital interface of the developed system where users can browse products offered by Battlefront Computer Trading, manage shopping carts, </w:t>
-      </w:r>
-      <w:r>
-        <w:rPr>
-          <w:rFonts w:ascii="Times New Roman" w:eastAsia="Times New Roman" w:hAnsi="Times New Roman" w:cs="Times New Roman"/>
-          <w:sz w:val="24"/>
-          <w:szCs w:val="24"/>
-        </w:rPr>
-        <w:lastRenderedPageBreak/>
-        <w:t>place orders, track order status, and manage their accounts through the web or mobile application.</w:t>
+        <w:t xml:space="preserve"> In this study, it refers to the customer-facing digital interface of the developed system where users can browse products offered by Battlefront Computer Trading, manage shopping carts, place orders, track order status, and manage their accounts through the web or mobile application.</w:t>
       </w:r>
     </w:p>
     <w:p>
@@ -2375,6 +2367,7 @@
           <w:sz w:val="24"/>
           <w:szCs w:val="24"/>
         </w:rPr>
+        <w:lastRenderedPageBreak/>
         <w:t>Inventory Management</w:t>
       </w:r>
     </w:p>
@@ -2398,7 +2391,6 @@
           <w:sz w:val="24"/>
           <w:szCs w:val="24"/>
         </w:rPr>
-        <w:lastRenderedPageBreak/>
         <w:t>Conceptual:</w:t>
       </w:r>
       <w:r>
@@ -2521,7 +2513,7 @@
           <w:sz w:val="24"/>
           <w:szCs w:val="24"/>
         </w:rPr>
-        <w:t xml:space="preserve"> In this study, it refers to the module that processes Battlefront Computer Trading's historical sales and inventory data, aggregated on a quarterly basis, using moving average and linear trend </w:t>
+        <w:t xml:space="preserve"> In this study, it refers to the module that uses a trailing four-quarter simple moving average of Battlefront Computer Trading's </w:t>
       </w:r>
       <w:r>
         <w:rPr>
@@ -2530,7 +2522,7 @@
           <w:szCs w:val="24"/>
         </w:rPr>
         <w:lastRenderedPageBreak/>
-        <w:t>regression techniques to forecast product demand and identify sales trends for business decision-making.</w:t>
+        <w:t>covered historical product unit sales to estimate demand for the quarter beginning at the current calendar-quarter boundary. Current inventory is separate planning context. The module uses one deterministic, non-machine-learning forecasting method.</w:t>
       </w:r>
     </w:p>
     <w:p>
@@ -2673,7 +2665,16 @@
           <w:sz w:val="24"/>
           <w:szCs w:val="24"/>
         </w:rPr>
-        <w:t xml:space="preserve"> A data-driven process that utilizes historical demand patterns and predictive modeling to estimate future sales volume and consumer demand, providing a critical foundation for organizational decision-making, inventory optimization, and financial planning to enhance profitability (IBM, n.d.-b).</w:t>
+        <w:t xml:space="preserve"> A data-driven process that utilizes historical demand patterns and predictive modeling to estimate future sales volume and consumer demand, providing a critical foundation for organizational </w:t>
+      </w:r>
+      <w:r>
+        <w:rPr>
+          <w:rFonts w:ascii="Times New Roman" w:eastAsia="Times New Roman" w:hAnsi="Times New Roman" w:cs="Times New Roman"/>
+          <w:sz w:val="24"/>
+          <w:szCs w:val="24"/>
+        </w:rPr>
+        <w:lastRenderedPageBreak/>
+        <w:t>decision-making, inventory optimization, and financial planning to enhance profitability (IBM, n.d.-b).</w:t>
       </w:r>
     </w:p>
     <w:p>
@@ -2696,7 +2697,6 @@
           <w:sz w:val="24"/>
           <w:szCs w:val="24"/>
         </w:rPr>
-        <w:lastRenderedPageBreak/>
         <w:t>Operational:</w:t>
       </w:r>
       <w:r>
@@ -2705,7 +2705,7 @@
           <w:sz w:val="24"/>
           <w:szCs w:val="24"/>
         </w:rPr>
-        <w:t xml:space="preserve"> In this study, it refers to the predictive function that analyzes historical sales transactions of Battlefront Computer Trading, aggregated on a quarterly basis, to estimate future product demand and sales trends using moving average and linear trend regression, supporting inventory planning and business decision-making.</w:t>
+        <w:t xml:space="preserve"> In this study, it refers to the predictive function that averages product quantities sold in the four most recent completed calendar quarters to estimate demand for the full current/upcoming quarter. The incomplete target quarter is excluded from historical inputs. Estimates support inventory planning and business judgment rather than guaranteeing future demand.</w:t>
       </w:r>
     </w:p>
     <w:p>
@@ -2812,7 +2812,7 @@
           <w:sz w:val="24"/>
           <w:szCs w:val="24"/>
         </w:rPr>
-        <w:t xml:space="preserve"> In this study, it refers to the integrated map feature that displays the geographical locations of Battlefront Computer Trading branches in Sagay City, Escalante City, San Carlos City, and Guihulngan City, providing customers with addresses, contact details, and operating hours. Only the Sagay City branch, the site of the study's requirements gathering, testing, and evaluation, is reflected with full operational detail (e.g., live stock and order information); the Escalante City, San Carlos City, and Guihulngan City branches are included for </w:t>
+        <w:t xml:space="preserve"> In this study, it refers to the integrated map feature that displays the geographical locations of Battlefront Computer Trading branches in Sagay City, Escalante City, San Carlos City, and Guihulngan City, providing customers with addresses, contact details, and operating hours. Only the Sagay City branch, the site of the study's </w:t>
       </w:r>
       <w:r>
         <w:rPr>
@@ -2821,7 +2821,7 @@
           <w:szCs w:val="24"/>
         </w:rPr>
         <w:lastRenderedPageBreak/>
-        <w:t>customer reference only, with static contact and location information supplied by the business owner.</w:t>
+        <w:t>requirements gathering, testing, and evaluation, is reflected with full operational detail (e.g., live stock and order information); the Escalante City, San Carlos City, and Guihulngan City branches are included for customer reference only, with static contact and location information supplied by the business owner.</w:t>
       </w:r>
     </w:p>
     <w:p>
@@ -2892,7 +2892,7 @@
           <w:sz w:val="24"/>
           <w:szCs w:val="24"/>
         </w:rPr>
-        <w:t>The study also draws on Decision Support System (DSS) theory (Turban et al., 2018), which holds that information systems can extend human decision-making by organizing data and applying models to generate actionable recommendations rather than replacing managerial judgment outright. This principle underpins the system's predictive analytics and product recommendation modules, which are designed to support, not replace the business owner's inventory and sales decisions. Complementing this, the study applies rule-based reasoning theory (Ricci, Rokach, &amp; Shapira, 2015), which explains how systems can generate reliable outputs by matching explicit, predefined conditions against input data. This principle grounds both the recommendation engine's criterion-matching logic and the chatbot's query-</w:t>
+        <w:t xml:space="preserve">The study also draws on Decision Support System (DSS) theory (Turban et al., 2018), which holds that information systems can extend human decision-making by organizing data and applying models to generate actionable recommendations rather than replacing managerial judgment outright. This principle underpins the system's predictive analytics and product recommendation modules, which are designed to support, not replace the business owner's inventory and sales decisions. Complementing this, the study applies rule-based reasoning theory (Ricci, Rokach, &amp; Shapira, 2015), which explains how systems can generate reliable outputs by </w:t>
       </w:r>
       <w:r>
         <w:rPr>
@@ -2901,7 +2901,7 @@
           <w:szCs w:val="24"/>
         </w:rPr>
         <w:lastRenderedPageBreak/>
-        <w:t>categorization mechanism, both of which rely on deterministic rules rather than inferred behavioral patterns.</w:t>
+        <w:t>matching explicit, predefined conditions against input data. This principle grounds both the recommendation engine's criterion-matching logic and the chatbot's query-categorization mechanism, both of which rely on deterministic rules rather than inferred behavioral patterns.</w:t>
       </w:r>
     </w:p>
     <w:p>
@@ -5467,7 +5467,16 @@
           <w:sz w:val="24"/>
           <w:szCs w:val="24"/>
         </w:rPr>
-        <w:t>This provides a conceptual basis for generating relevant product suggestions based on product characteristics and customer-defined criteria. However, because the proposed system serves a smaller retail catalog with limited historical interaction data, this study applies rule-based filtering rather than review-derived or collaborative recommendation techniques</w:t>
+        <w:t xml:space="preserve">This provides a conceptual basis for generating relevant product suggestions based on product characteristics and customer-defined criteria. However, because the proposed system serves a smaller retail catalog with limited historical interaction data, </w:t>
+      </w:r>
+      <w:r>
+        <w:rPr>
+          <w:rFonts w:ascii="Times New Roman" w:eastAsia="Times New Roman" w:hAnsi="Times New Roman" w:cs="Times New Roman"/>
+          <w:sz w:val="24"/>
+          <w:szCs w:val="24"/>
+        </w:rPr>
+        <w:lastRenderedPageBreak/>
+        <w:t>this study applies rule-based filtering rather than review-derived or collaborative recommendation techniques</w:t>
       </w:r>
       <w:r>
         <w:rPr>
@@ -5495,8 +5504,76 @@
           <w:sz w:val="24"/>
           <w:szCs w:val="24"/>
         </w:rPr>
+        <w:t>Predictive Analytics for Inventory and Demand Forecasting</w:t>
+      </w:r>
+    </w:p>
+    <w:p>
+      <w:pPr>
+        <w:spacing w:before="240" w:after="240" w:line="480" w:lineRule="auto"/>
+        <w:ind w:firstLine="720"/>
+        <w:jc w:val="both"/>
+        <w:rPr>
+          <w:rFonts w:ascii="Times New Roman" w:eastAsia="Times New Roman" w:hAnsi="Times New Roman" w:cs="Times New Roman"/>
+          <w:sz w:val="24"/>
+          <w:szCs w:val="24"/>
+        </w:rPr>
+      </w:pPr>
+      <w:r>
+        <w:rPr>
+          <w:rFonts w:ascii="Times New Roman" w:eastAsia="Times New Roman" w:hAnsi="Times New Roman" w:cs="Times New Roman"/>
+          <w:sz w:val="24"/>
+          <w:szCs w:val="24"/>
+        </w:rPr>
+        <w:t>Accurate demand forecasting continues to be central to reducing stockouts and overstocking, particularly for smaller retailers with limited working capital. Franco, Guevara, Castaneda, Mansilla-Lopez, and Garcia-Nunez (2026) proposed a lightweight Random Forest-based forecasting framework built specifically for micro and small enterprises (MSEs), achieving a Mean Absolute Percentage Error of 2.41% and outperforming K-Nearest Neighbors, Decision Tree, and XGBoost models while remaining computationally inexpensive enough for resource-constrained businesses. This supports the broader feasibility of lightweight forecasting approaches for businesses at Battlefront Computer Trading's scale, though this study adopts a simpler, non-machine-learning approach — a trailing four-quarter simple moving average — given the smaller transaction volume and scope of a single-branch capstone deployment</w:t>
+      </w:r>
+      <w:r>
+        <w:rPr>
+          <w:rFonts w:ascii="Times New Roman" w:eastAsia="Times New Roman" w:hAnsi="Times New Roman" w:cs="Times New Roman"/>
+          <w:sz w:val="24"/>
+          <w:szCs w:val="24"/>
+        </w:rPr>
+        <w:t>.</w:t>
+      </w:r>
+    </w:p>
+    <w:p>
+      <w:pPr>
+        <w:spacing w:before="240" w:after="240" w:line="480" w:lineRule="auto"/>
+        <w:ind w:firstLine="720"/>
+        <w:jc w:val="both"/>
+        <w:rPr>
+          <w:rFonts w:ascii="Times New Roman" w:eastAsia="Times New Roman" w:hAnsi="Times New Roman" w:cs="Times New Roman"/>
+          <w:sz w:val="24"/>
+          <w:szCs w:val="24"/>
+        </w:rPr>
+      </w:pPr>
+      <w:r>
+        <w:rPr>
+          <w:rFonts w:ascii="Times New Roman" w:eastAsia="Times New Roman" w:hAnsi="Times New Roman" w:cs="Times New Roman"/>
+          <w:sz w:val="24"/>
+          <w:szCs w:val="24"/>
+        </w:rPr>
+        <w:t>Complementing this, Alam, Thakur, and Islam (2024) conducted a qualitative case study of inventory management practices among small and medium enterprises in Bangladesh and found that most SME owners still rely on manual, experience-based stock decisions rather than structured forecasting tools, largely due to limited technical capacity and financing. This reinforces that the absence of predictive inventory tools in small trading businesses, such as Battlefront, reflects a broader, well-documented pattern among resource-constrained SMEs rather than an isolated local gap.</w:t>
+      </w:r>
+    </w:p>
+    <w:p>
+      <w:pPr>
+        <w:spacing w:before="240" w:after="240" w:line="480" w:lineRule="auto"/>
+        <w:rPr>
+          <w:rFonts w:ascii="Times New Roman" w:eastAsia="Times New Roman" w:hAnsi="Times New Roman" w:cs="Times New Roman"/>
+          <w:b/>
+          <w:sz w:val="24"/>
+          <w:szCs w:val="24"/>
+        </w:rPr>
+      </w:pPr>
+      <w:r>
+        <w:rPr>
+          <w:rFonts w:ascii="Times New Roman" w:eastAsia="Times New Roman" w:hAnsi="Times New Roman" w:cs="Times New Roman"/>
+          <w:b/>
+          <w:sz w:val="24"/>
+          <w:szCs w:val="24"/>
+        </w:rPr>
         <w:lastRenderedPageBreak/>
-        <w:t>Predictive Analytics for Inventory and Demand Forecasting</w:t>
+        <w:t>Chatbots and Conversational Interfaces in Customer Service</w:t>
       </w:r>
     </w:p>
     <w:p>
@@ -5516,15 +5593,7 @@
           <w:sz w:val="24"/>
           <w:szCs w:val="24"/>
         </w:rPr>
-        <w:t>Accurate demand forecasting continues to be central to reducing stockouts and overstocking, particularly for smaller retailers with limited working capital. Franco, Guevara, Castaneda, Mansilla-Lopez, and Garcia-Nunez (2026) proposed a lightweight Random Forest-based forecasting framework built specifically for micro and small enterprises (MSEs), achieving a Mean Absolute Percentage Error of 2.41% and outperforming K-Nearest Neighbors, Decision Tree, and XGBoost models while remaining computationally inexpensive enough for resource-constrained businesses. This supports the broader feasibility of lightweight forecasting approaches for businesses at Battlefront Computer Trading's scale, though this study adopts a simpler, non-machine-learning approach — moving average and linear trend regression — given the smaller transaction volume and scope of a single-branch capstone deployment</w:t>
-      </w:r>
-      <w:r>
-        <w:rPr>
-          <w:rFonts w:ascii="Times New Roman" w:eastAsia="Times New Roman" w:hAnsi="Times New Roman" w:cs="Times New Roman"/>
-          <w:sz w:val="24"/>
-          <w:szCs w:val="24"/>
-        </w:rPr>
-        <w:t>.</w:t>
+        <w:t>Chatbots have grown in popularity as a low-cost way for businesses to provide round-the-clock customer support. Marcineková, Sujová, and Ďurica (2025) conducted a mixed-method case study of an AI-powered chatbot deployed in a Slovak micro-enterprise's e-commerce operation and found that the chatbot cut average response time by nearly 46% and produced a statistically significant increase in customer satisfaction, though it still struggled with ambiguous or emotionally complex queries, underscoring that even a modest, catalog-aware chatbot can meaningfully improve customer service in a small retail business without requiring a large-scale generative AI system.</w:t>
       </w:r>
     </w:p>
     <w:p>
@@ -5544,7 +5613,28 @@
           <w:sz w:val="24"/>
           <w:szCs w:val="24"/>
         </w:rPr>
-        <w:t>Complementing this, Alam, Thakur, and Islam (2024) conducted a qualitative case study of inventory management practices among small and medium enterprises in Bangladesh and found that most SME owners still rely on manual, experience-based stock decisions rather than structured forecasting tools, largely due to limited technical capacity and financing. This reinforces that the absence of predictive inventory tools in small trading businesses, such as Battlefront, reflects a broader, well-documented pattern among resource-constrained SMEs rather than an isolated local gap.</w:t>
+        <w:t>At a larger operational scale, Panigrahi, Shrivastava, Qureshi, Mewada, Alghamdi, Almakayeel, Almuflih, and Qureshi (2023) examined AI chatbot adoption among manufacturing SMEs and found that chatbot-enabled supply chain visibility positively influenced sustainable supply chain performance, mediated by the firm's innovation capability. While their focus was manufacturing supply chains rather than retail customer service, the finding that chatbot value depends on integration with a firm's existing operational data supports this study's design decision to link the chatbot directly to Battlefront's product catalog and inventory records rather than deploying it as a standalone FAQ tool.</w:t>
+      </w:r>
+    </w:p>
+    <w:p>
+      <w:pPr>
+        <w:spacing w:line="480" w:lineRule="auto"/>
+        <w:jc w:val="center"/>
+        <w:rPr>
+          <w:rFonts w:ascii="Times New Roman" w:eastAsia="Times New Roman" w:hAnsi="Times New Roman" w:cs="Times New Roman"/>
+          <w:b/>
+          <w:sz w:val="24"/>
+          <w:szCs w:val="24"/>
+        </w:rPr>
+      </w:pPr>
+      <w:r>
+        <w:rPr>
+          <w:rFonts w:ascii="Times New Roman" w:eastAsia="Times New Roman" w:hAnsi="Times New Roman" w:cs="Times New Roman"/>
+          <w:b/>
+          <w:sz w:val="24"/>
+          <w:szCs w:val="24"/>
+        </w:rPr>
+        <w:t>Philippine Setting</w:t>
       </w:r>
     </w:p>
     <w:p>
@@ -5564,7 +5654,7 @@
           <w:sz w:val="24"/>
           <w:szCs w:val="24"/>
         </w:rPr>
-        <w:t>Chatbots and Conversational Interfaces in Customer Service</w:t>
+        <w:t>Product Recommendation Systems in Philippine Retail</w:t>
       </w:r>
     </w:p>
     <w:p>
@@ -5585,12 +5675,32 @@
           <w:szCs w:val="24"/>
         </w:rPr>
         <w:lastRenderedPageBreak/>
-        <w:t>Chatbots have grown in popularity as a low-cost way for businesses to provide round-the-clock customer support. Marcineková, Sujová, and Ďurica (2025) conducted a mixed-method case study of an AI-powered chatbot deployed in a Slovak micro-enterprise's e-commerce operation and found that the chatbot cut average response time by nearly 46% and produced a statistically significant increase in customer satisfaction, though it still struggled with ambiguous or emotionally complex queries, underscoring that even a modest, catalog-aware chatbot can meaningfully improve customer service in a small retail business without requiring a large-scale generative AI system.</w:t>
+        <w:t>Locally, Samonte, Villaluz, Cabamongan, Gayeta, Palomo, and Samonte (2022) developed Market-e, a Philippine e-commerce platform for local wet-market vendors that embedded a recommender feature alongside an inventory management module. Their evaluation, which combined Nielsen's Heuristic Evaluation with the Questionnaire for User Interface Satisfaction across consumers, vendors, and store owners, found that the inventory feature was rated as the system's most impactful component. This finding directly supports the present study's decision to pair a recommendation engine with inventory management rather than treating them as separate systems, and demonstrates that Filipino researchers have already validated this combination as usable and beneficial for local retail operations.</w:t>
       </w:r>
     </w:p>
     <w:p>
       <w:pPr>
         <w:spacing w:before="240" w:after="240" w:line="480" w:lineRule="auto"/>
+        <w:rPr>
+          <w:rFonts w:ascii="Times New Roman" w:eastAsia="Times New Roman" w:hAnsi="Times New Roman" w:cs="Times New Roman"/>
+          <w:b/>
+          <w:sz w:val="24"/>
+          <w:szCs w:val="24"/>
+        </w:rPr>
+      </w:pPr>
+      <w:r>
+        <w:rPr>
+          <w:rFonts w:ascii="Times New Roman" w:eastAsia="Times New Roman" w:hAnsi="Times New Roman" w:cs="Times New Roman"/>
+          <w:b/>
+          <w:sz w:val="24"/>
+          <w:szCs w:val="24"/>
+        </w:rPr>
+        <w:t>Predictive Analytics for Inventory and Demand Forecasting in the Philippines</w:t>
+      </w:r>
+    </w:p>
+    <w:p>
+      <w:pPr>
+        <w:spacing w:before="240" w:after="240" w:line="480" w:lineRule="auto"/>
         <w:ind w:firstLine="720"/>
         <w:jc w:val="both"/>
         <w:rPr>
@@ -5605,28 +5715,7 @@
           <w:sz w:val="24"/>
           <w:szCs w:val="24"/>
         </w:rPr>
-        <w:t>At a larger operational scale, Panigrahi, Shrivastava, Qureshi, Mewada, Alghamdi, Almakayeel, Almuflih, and Qureshi (2023) examined AI chatbot adoption among manufacturing SMEs and found that chatbot-enabled supply chain visibility positively influenced sustainable supply chain performance, mediated by the firm's innovation capability. While their focus was manufacturing supply chains rather than retail customer service, the finding that chatbot value depends on integration with a firm's existing operational data supports this study's design decision to link the chatbot directly to Battlefront's product catalog and inventory records rather than deploying it as a standalone FAQ tool.</w:t>
-      </w:r>
-    </w:p>
-    <w:p>
-      <w:pPr>
-        <w:spacing w:line="480" w:lineRule="auto"/>
-        <w:jc w:val="center"/>
-        <w:rPr>
-          <w:rFonts w:ascii="Times New Roman" w:eastAsia="Times New Roman" w:hAnsi="Times New Roman" w:cs="Times New Roman"/>
-          <w:b/>
-          <w:sz w:val="24"/>
-          <w:szCs w:val="24"/>
-        </w:rPr>
-      </w:pPr>
-      <w:r>
-        <w:rPr>
-          <w:rFonts w:ascii="Times New Roman" w:eastAsia="Times New Roman" w:hAnsi="Times New Roman" w:cs="Times New Roman"/>
-          <w:b/>
-          <w:sz w:val="24"/>
-          <w:szCs w:val="24"/>
-        </w:rPr>
-        <w:t>Philippine Setting</w:t>
+        <w:t>A directly comparable local study is that of Arnaiz, Cristal, Fernandez, Gubaton, Tanael, and Centeno (2023), who developed a time-series-based inventory management and demand forecasting system for a Philippine retail store. Their system addressed the same core problems this study aims to solve manual inventory tracking, inaccurate demand prediction, and excess or expired stock and demonstrated that time-series forecasting is a viable, locally proven approach for small Philippine retailers, reinforcing the feasibility of the predictive analytics module proposed for Battlefront Computer Trading.</w:t>
       </w:r>
     </w:p>
     <w:p>
@@ -5646,7 +5735,7 @@
           <w:sz w:val="24"/>
           <w:szCs w:val="24"/>
         </w:rPr>
-        <w:t>Product Recommendation Systems in Philippine Retail</w:t>
+        <w:t>Chatbots and Conversational Interfaces among Filipino Consumers</w:t>
       </w:r>
     </w:p>
     <w:p>
@@ -5666,16 +5755,8 @@
           <w:sz w:val="24"/>
           <w:szCs w:val="24"/>
         </w:rPr>
-        <w:t xml:space="preserve">Locally, Samonte, Villaluz, Cabamongan, Gayeta, Palomo, and Samonte (2022) developed Market-e, a Philippine e-commerce platform for local wet-market vendors </w:t>
-      </w:r>
-      <w:r>
-        <w:rPr>
-          <w:rFonts w:ascii="Times New Roman" w:eastAsia="Times New Roman" w:hAnsi="Times New Roman" w:cs="Times New Roman"/>
-          <w:sz w:val="24"/>
-          <w:szCs w:val="24"/>
-        </w:rPr>
         <w:lastRenderedPageBreak/>
-        <w:t>that embedded a recommender feature alongside an inventory management module. Their evaluation, which combined Nielsen's Heuristic Evaluation with the Questionnaire for User Interface Satisfaction across consumers, vendors, and store owners, found that the inventory feature was rated as the system's most impactful component. This finding directly supports the present study's decision to pair a recommendation engine with inventory management rather than treating them as separate systems, and demonstrates that Filipino researchers have already validated this combination as usable and beneficial for local retail operations.</w:t>
+        <w:t>In the Philippine context, Pastorfide and Vasquez (2025) examined AI chatbot adoption among 392 online shoppers in Nueva Ecija using the Expectation Confirmation Theory alongside ISO/IEC 25010 quality criteria. Their findings showed that Filipino consumers place particularly high value on 24/7 availability, prompt and accurate responses, and notably multilingual support that includes Tagalog, which scored as the single highest-rated customer expectation in their study. This finding has direct implications for the present study's chatbot design: a chatbot built for Battlefront Computer Trading's customer base should account for code-switching between English and Filipino/Tagalog rather than assuming English-only interactions.</w:t>
       </w:r>
     </w:p>
     <w:p>
@@ -5695,7 +5776,7 @@
           <w:sz w:val="24"/>
           <w:szCs w:val="24"/>
         </w:rPr>
-        <w:t>Predictive Analytics for Inventory and Demand Forecasting in the Philippines</w:t>
+        <w:t>Broader Philippine MSME Digital Adoption</w:t>
       </w:r>
     </w:p>
     <w:p>
@@ -5715,7 +5796,7 @@
           <w:sz w:val="24"/>
           <w:szCs w:val="24"/>
         </w:rPr>
-        <w:t>A directly comparable local study is that of Arnaiz, Cristal, Fernandez, Gubaton, Tanael, and Centeno (2023), who developed a time-series-based inventory management and demand forecasting system for a Philippine retail store. Their system addressed the same core problems this study aims to solve manual inventory tracking, inaccurate demand prediction, and excess or expired stock and demonstrated that time-series forecasting is a viable, locally proven approach for small Philippine retailers, reinforcing the feasibility of the predictive analytics module proposed for Battlefront Computer Trading.</w:t>
+        <w:t>Beyond the studies already discussed, broader research on Philippine MSME digitalization provides useful context. Cordova, Lim, Ong, Caraan, Dela Cruz, and Jimenez (2025) found that while Philippine MSMEs are increasingly adopting basic digital tools such as social media marketing and digital payment platforms, they have largely not adopted more advanced technologies such as cloud computing or ERP-level systems, citing cultural resistance, limited technical expertise, and financial constraints as the leading barriers. This supports the present study's framing of an integrated recommendation-forecasting-chatbot system as addressing a documented, evidence-based gap in Philippine MSME technology adoption rather than an assumed one.</w:t>
       </w:r>
     </w:p>
     <w:p>
@@ -5735,12 +5816,32 @@
           <w:sz w:val="24"/>
           <w:szCs w:val="24"/>
         </w:rPr>
-        <w:t>Chatbots and Conversational Interfaces among Filipino Consumers</w:t>
+        <w:t>Prior Arts</w:t>
       </w:r>
     </w:p>
     <w:p>
       <w:pPr>
         <w:spacing w:before="240" w:after="240" w:line="480" w:lineRule="auto"/>
+        <w:rPr>
+          <w:rFonts w:ascii="Times New Roman" w:eastAsia="Times New Roman" w:hAnsi="Times New Roman" w:cs="Times New Roman"/>
+          <w:b/>
+          <w:sz w:val="24"/>
+          <w:szCs w:val="24"/>
+        </w:rPr>
+      </w:pPr>
+      <w:r>
+        <w:rPr>
+          <w:rFonts w:ascii="Times New Roman" w:eastAsia="Times New Roman" w:hAnsi="Times New Roman" w:cs="Times New Roman"/>
+          <w:b/>
+          <w:sz w:val="24"/>
+          <w:szCs w:val="24"/>
+        </w:rPr>
+        <w:t>E-Commerce Platforms with Recommendation Features</w:t>
+      </w:r>
+    </w:p>
+    <w:p>
+      <w:pPr>
+        <w:spacing w:before="240" w:after="240" w:line="480" w:lineRule="auto"/>
         <w:ind w:firstLine="720"/>
         <w:jc w:val="both"/>
         <w:rPr>
@@ -5755,16 +5856,8 @@
           <w:sz w:val="24"/>
           <w:szCs w:val="24"/>
         </w:rPr>
-        <w:t xml:space="preserve">In the Philippine context, Pastorfide and Vasquez (2025) examined AI chatbot adoption among 392 online shoppers in Nueva Ecija using the Expectation Confirmation Theory alongside ISO/IEC 25010 quality criteria. Their findings showed </w:t>
-      </w:r>
-      <w:r>
-        <w:rPr>
-          <w:rFonts w:ascii="Times New Roman" w:eastAsia="Times New Roman" w:hAnsi="Times New Roman" w:cs="Times New Roman"/>
-          <w:sz w:val="24"/>
-          <w:szCs w:val="24"/>
-        </w:rPr>
         <w:lastRenderedPageBreak/>
-        <w:t>that Filipino consumers place particularly high value on 24/7 availability, prompt and accurate responses, and notably multilingual support that includes Tagalog, which scored as the single highest-rated customer expectation in their study. This finding has direct implications for the present study's chatbot design: a chatbot built for Battlefront Computer Trading's customer base should account for code-switching between English and Filipino/Tagalog rather than assuming English-only interactions.</w:t>
+        <w:t>Commercial platforms continue to demonstrate the value of recommendation-driven retail. Regional marketplaces such as Shopee and Lazada apply algorithmic product recommendations during browsing and checkout, reflecting the continued commercial reliance on recommendation-driven cross-selling in Southeast Asian e-commerce. At the small-business scale, Samonte et al.'s (2022) Market-e platform, discussed above, demonstrates that Filipino-built systems have already applied comparable recommendation techniques successfully, validating that the underlying approach scales down from large marketplaces to single-vendor retail contexts such as Battlefront Computer Trading.</w:t>
       </w:r>
     </w:p>
     <w:p>
@@ -5784,7 +5877,7 @@
           <w:sz w:val="24"/>
           <w:szCs w:val="24"/>
         </w:rPr>
-        <w:t>Broader Philippine MSME Digital Adoption</w:t>
+        <w:t>Inventory and Sales Management Systems</w:t>
       </w:r>
     </w:p>
     <w:p>
@@ -5804,7 +5897,7 @@
           <w:sz w:val="24"/>
           <w:szCs w:val="24"/>
         </w:rPr>
-        <w:t>Beyond the studies already discussed, broader research on Philippine MSME digitalization provides useful context. Cordova, Lim, Ong, Caraan, Dela Cruz, and Jimenez (2025) found that while Philippine MSMEs are increasingly adopting basic digital tools such as social media marketing and digital payment platforms, they have largely not adopted more advanced technologies such as cloud computing or ERP-level systems, citing cultural resistance, limited technical expertise, and financial constraints as the leading barriers. This supports the present study's framing of an integrated recommendation-forecasting-chatbot system as addressing a documented, evidence-based gap in Philippine MSME technology adoption rather than an assumed one.</w:t>
+        <w:t>Commercial small-business tools such as Loyverse and Vend provide point-of-sale and inventory tracking but generally rely on descriptive reporting rather than predictive analytics, while larger ERP platforms such as SAP Business One incorporate demand forecasting modules that are often too costly and complex for small trading businesses to adopt. Arnaiz et al.'s (2023) locally developed forecasting system and Franco et al.'s (2026) MSE-oriented Random Forest model, both discussed earlier, represent closer-scale alternatives, though neither was built for a computer hardware catalog specifically.</w:t>
       </w:r>
     </w:p>
     <w:p>
@@ -5824,32 +5917,69 @@
           <w:sz w:val="24"/>
           <w:szCs w:val="24"/>
         </w:rPr>
-        <w:t>Prior Arts</w:t>
+        <w:t>AI-Powered Retail Chatbot Platforms</w:t>
       </w:r>
     </w:p>
     <w:p>
       <w:pPr>
         <w:spacing w:before="240" w:after="240" w:line="480" w:lineRule="auto"/>
-        <w:rPr>
-          <w:rFonts w:ascii="Times New Roman" w:eastAsia="Times New Roman" w:hAnsi="Times New Roman" w:cs="Times New Roman"/>
-          <w:b/>
-          <w:sz w:val="24"/>
-          <w:szCs w:val="24"/>
-        </w:rPr>
-      </w:pPr>
-      <w:r>
-        <w:rPr>
-          <w:rFonts w:ascii="Times New Roman" w:eastAsia="Times New Roman" w:hAnsi="Times New Roman" w:cs="Times New Roman"/>
-          <w:b/>
-          <w:sz w:val="24"/>
-          <w:szCs w:val="24"/>
-        </w:rPr>
-        <w:t>E-Commerce Platforms with Recommendation Features</w:t>
+        <w:ind w:firstLine="720"/>
+        <w:jc w:val="both"/>
+        <w:rPr>
+          <w:rFonts w:ascii="Times New Roman" w:eastAsia="Times New Roman" w:hAnsi="Times New Roman" w:cs="Times New Roman"/>
+          <w:sz w:val="24"/>
+          <w:szCs w:val="24"/>
+        </w:rPr>
+      </w:pPr>
+      <w:r>
+        <w:rPr>
+          <w:rFonts w:ascii="Times New Roman" w:eastAsia="Times New Roman" w:hAnsi="Times New Roman" w:cs="Times New Roman"/>
+          <w:sz w:val="24"/>
+          <w:szCs w:val="24"/>
+        </w:rPr>
+        <w:t xml:space="preserve">Commercial chatbot platforms such as Tidio and ManyChat allow retail businesses to automate responses to common inquiries across web and social channels. </w:t>
+      </w:r>
+      <w:r>
+        <w:rPr>
+          <w:rFonts w:ascii="Times New Roman" w:eastAsia="Times New Roman" w:hAnsi="Times New Roman" w:cs="Times New Roman"/>
+          <w:sz w:val="24"/>
+          <w:szCs w:val="24"/>
+        </w:rPr>
+        <w:lastRenderedPageBreak/>
+        <w:t>While useful for general customer engagement, generic chatbot platforms may provide limited responses when customers ask catalog-specific questions involving product availability, specifications, order information, and store details. This supports the development of a catalog-aware chatbot grounded in Battlefront Computer Trading’s own product, inventory, order, and store information</w:t>
+      </w:r>
+      <w:r>
+        <w:rPr>
+          <w:rFonts w:ascii="Times New Roman" w:eastAsia="Times New Roman" w:hAnsi="Times New Roman" w:cs="Times New Roman"/>
+          <w:sz w:val="24"/>
+          <w:szCs w:val="24"/>
+        </w:rPr>
+        <w:t>. Pastorfide and Vasquez's (2025) Nueva Ecija study and Marcineková et al.'s (2025) Slovak micro-enterprise case study, both discussed above, indicate that customers and small business owners alike evaluate chatbots primarily on functional suitability and response accuracy rather than novelty suggesting that a catalog-aware chatbot built specifically around Battlefront's product line could outperform generic platforms on the dimensions users care about most.</w:t>
       </w:r>
     </w:p>
     <w:p>
       <w:pPr>
         <w:spacing w:before="240" w:after="240" w:line="480" w:lineRule="auto"/>
+        <w:rPr>
+          <w:rFonts w:ascii="Times New Roman" w:eastAsia="Times New Roman" w:hAnsi="Times New Roman" w:cs="Times New Roman"/>
+          <w:b/>
+          <w:sz w:val="24"/>
+          <w:szCs w:val="24"/>
+        </w:rPr>
+      </w:pPr>
+      <w:r>
+        <w:rPr>
+          <w:rFonts w:ascii="Times New Roman" w:eastAsia="Times New Roman" w:hAnsi="Times New Roman" w:cs="Times New Roman"/>
+          <w:b/>
+          <w:sz w:val="24"/>
+          <w:szCs w:val="24"/>
+        </w:rPr>
+        <w:t>Philippine-Based Prior Arts</w:t>
+      </w:r>
+    </w:p>
+    <w:p>
+      <w:pPr>
+        <w:spacing w:before="240" w:after="240" w:line="480" w:lineRule="auto"/>
         <w:ind w:firstLine="720"/>
         <w:jc w:val="both"/>
         <w:rPr>
@@ -5864,7 +5994,58 @@
           <w:sz w:val="24"/>
           <w:szCs w:val="24"/>
         </w:rPr>
-        <w:t xml:space="preserve">Commercial platforms continue to demonstrate the value of recommendation-driven retail. Regional marketplaces such as Shopee and Lazada apply algorithmic product recommendations during browsing and checkout, reflecting the continued </w:t>
+        <w:t>Cordova et al.'s (2025) findings on Philippine MSME digital adoption, discussed above, further confirm that advanced, integrated digital tools remain rare among small Philippine trading businesses, reinforcing that a locally built, integrated system such as the one proposed here would fill a documented rather than assumed gap.</w:t>
+      </w:r>
+    </w:p>
+    <w:p>
+      <w:pPr>
+        <w:spacing w:before="240" w:after="240" w:line="480" w:lineRule="auto"/>
+        <w:rPr>
+          <w:rFonts w:ascii="Times New Roman" w:eastAsia="Times New Roman" w:hAnsi="Times New Roman" w:cs="Times New Roman"/>
+          <w:b/>
+          <w:sz w:val="24"/>
+          <w:szCs w:val="24"/>
+        </w:rPr>
+      </w:pPr>
+    </w:p>
+    <w:p>
+      <w:pPr>
+        <w:spacing w:before="240" w:after="240" w:line="480" w:lineRule="auto"/>
+        <w:rPr>
+          <w:rFonts w:ascii="Times New Roman" w:eastAsia="Times New Roman" w:hAnsi="Times New Roman" w:cs="Times New Roman"/>
+          <w:b/>
+          <w:sz w:val="24"/>
+          <w:szCs w:val="24"/>
+        </w:rPr>
+      </w:pPr>
+      <w:r>
+        <w:rPr>
+          <w:rFonts w:ascii="Times New Roman" w:eastAsia="Times New Roman" w:hAnsi="Times New Roman" w:cs="Times New Roman"/>
+          <w:b/>
+          <w:sz w:val="24"/>
+          <w:szCs w:val="24"/>
+        </w:rPr>
+        <w:t>Limitations of Current Systems</w:t>
+      </w:r>
+    </w:p>
+    <w:p>
+      <w:pPr>
+        <w:spacing w:before="240" w:after="240" w:line="480" w:lineRule="auto"/>
+        <w:ind w:firstLine="720"/>
+        <w:jc w:val="both"/>
+        <w:rPr>
+          <w:rFonts w:ascii="Times New Roman" w:eastAsia="Times New Roman" w:hAnsi="Times New Roman" w:cs="Times New Roman"/>
+          <w:sz w:val="24"/>
+          <w:szCs w:val="24"/>
+        </w:rPr>
+      </w:pPr>
+      <w:r>
+        <w:rPr>
+          <w:rFonts w:ascii="Times New Roman" w:eastAsia="Times New Roman" w:hAnsi="Times New Roman" w:cs="Times New Roman"/>
+          <w:sz w:val="24"/>
+          <w:szCs w:val="24"/>
+        </w:rPr>
+        <w:t xml:space="preserve">Taken together, these prior arts show that recommendation, forecasting, and chatbot capabilities have each been demonstrated locally and internationally, but no reviewed system, commercial or academic, combines even two of the three within a single Philippine computer hardware retail context, let alone all three. Samonte et al. </w:t>
       </w:r>
       <w:r>
         <w:rPr>
@@ -5873,212 +6054,7 @@
           <w:szCs w:val="24"/>
         </w:rPr>
         <w:lastRenderedPageBreak/>
-        <w:t>commercial reliance on recommendation-driven cross-selling in Southeast Asian e-commerce. At the small-business scale, Samonte et al.'s (2022) Market-e platform, discussed above, demonstrates that Filipino-built systems have already applied comparable recommendation techniques successfully, validating that the underlying approach scales down from large marketplaces to single-vendor retail contexts such as Battlefront Computer Trading.</w:t>
-      </w:r>
-    </w:p>
-    <w:p>
-      <w:pPr>
-        <w:spacing w:before="240" w:after="240" w:line="480" w:lineRule="auto"/>
-        <w:rPr>
-          <w:rFonts w:ascii="Times New Roman" w:eastAsia="Times New Roman" w:hAnsi="Times New Roman" w:cs="Times New Roman"/>
-          <w:b/>
-          <w:sz w:val="24"/>
-          <w:szCs w:val="24"/>
-        </w:rPr>
-      </w:pPr>
-      <w:r>
-        <w:rPr>
-          <w:rFonts w:ascii="Times New Roman" w:eastAsia="Times New Roman" w:hAnsi="Times New Roman" w:cs="Times New Roman"/>
-          <w:b/>
-          <w:sz w:val="24"/>
-          <w:szCs w:val="24"/>
-        </w:rPr>
-        <w:t>Inventory and Sales Management Systems</w:t>
-      </w:r>
-    </w:p>
-    <w:p>
-      <w:pPr>
-        <w:spacing w:before="240" w:after="240" w:line="480" w:lineRule="auto"/>
-        <w:ind w:firstLine="720"/>
-        <w:jc w:val="both"/>
-        <w:rPr>
-          <w:rFonts w:ascii="Times New Roman" w:eastAsia="Times New Roman" w:hAnsi="Times New Roman" w:cs="Times New Roman"/>
-          <w:sz w:val="24"/>
-          <w:szCs w:val="24"/>
-        </w:rPr>
-      </w:pPr>
-      <w:r>
-        <w:rPr>
-          <w:rFonts w:ascii="Times New Roman" w:eastAsia="Times New Roman" w:hAnsi="Times New Roman" w:cs="Times New Roman"/>
-          <w:sz w:val="24"/>
-          <w:szCs w:val="24"/>
-        </w:rPr>
-        <w:t>Commercial small-business tools such as Loyverse and Vend provide point-of-sale and inventory tracking but generally rely on descriptive reporting rather than predictive analytics, while larger ERP platforms such as SAP Business One incorporate demand forecasting modules that are often too costly and complex for small trading businesses to adopt. Arnaiz et al.'s (2023) locally developed forecasting system and Franco et al.'s (2026) MSE-oriented Random Forest model, both discussed earlier, represent closer-scale alternatives, though neither was built for a computer hardware catalog specifically.</w:t>
-      </w:r>
-    </w:p>
-    <w:p>
-      <w:pPr>
-        <w:spacing w:before="240" w:after="240" w:line="480" w:lineRule="auto"/>
-        <w:rPr>
-          <w:rFonts w:ascii="Times New Roman" w:eastAsia="Times New Roman" w:hAnsi="Times New Roman" w:cs="Times New Roman"/>
-          <w:b/>
-          <w:sz w:val="24"/>
-          <w:szCs w:val="24"/>
-        </w:rPr>
-      </w:pPr>
-      <w:r>
-        <w:rPr>
-          <w:rFonts w:ascii="Times New Roman" w:eastAsia="Times New Roman" w:hAnsi="Times New Roman" w:cs="Times New Roman"/>
-          <w:b/>
-          <w:sz w:val="24"/>
-          <w:szCs w:val="24"/>
-        </w:rPr>
-        <w:t>AI-Powered Retail Chatbot Platforms</w:t>
-      </w:r>
-    </w:p>
-    <w:p>
-      <w:pPr>
-        <w:spacing w:before="240" w:after="240" w:line="480" w:lineRule="auto"/>
-        <w:ind w:firstLine="720"/>
-        <w:jc w:val="both"/>
-        <w:rPr>
-          <w:rFonts w:ascii="Times New Roman" w:eastAsia="Times New Roman" w:hAnsi="Times New Roman" w:cs="Times New Roman"/>
-          <w:sz w:val="24"/>
-          <w:szCs w:val="24"/>
-        </w:rPr>
-      </w:pPr>
-      <w:r>
-        <w:rPr>
-          <w:rFonts w:ascii="Times New Roman" w:eastAsia="Times New Roman" w:hAnsi="Times New Roman" w:cs="Times New Roman"/>
-          <w:sz w:val="24"/>
-          <w:szCs w:val="24"/>
-        </w:rPr>
-        <w:t xml:space="preserve">Commercial chatbot platforms such as Tidio and ManyChat allow retail businesses to automate responses to common inquiries across web and social channels. </w:t>
-      </w:r>
-      <w:r>
-        <w:rPr>
-          <w:rFonts w:ascii="Times New Roman" w:eastAsia="Times New Roman" w:hAnsi="Times New Roman" w:cs="Times New Roman"/>
-          <w:sz w:val="24"/>
-          <w:szCs w:val="24"/>
-        </w:rPr>
-        <w:t xml:space="preserve">While useful for general customer engagement, generic chatbot platforms may provide limited responses when customers ask catalog-specific questions involving product availability, specifications, order information, and store details. This supports the </w:t>
-      </w:r>
-      <w:r>
-        <w:rPr>
-          <w:rFonts w:ascii="Times New Roman" w:eastAsia="Times New Roman" w:hAnsi="Times New Roman" w:cs="Times New Roman"/>
-          <w:sz w:val="24"/>
-          <w:szCs w:val="24"/>
-        </w:rPr>
-        <w:lastRenderedPageBreak/>
-        <w:t>development of a catalog-aware chatbot grounded in Battlefront Computer Trading’s own product, inventory, order, and store information</w:t>
-      </w:r>
-      <w:r>
-        <w:rPr>
-          <w:rFonts w:ascii="Times New Roman" w:eastAsia="Times New Roman" w:hAnsi="Times New Roman" w:cs="Times New Roman"/>
-          <w:sz w:val="24"/>
-          <w:szCs w:val="24"/>
-        </w:rPr>
-        <w:t>. Pastorfide and Vasquez's (2025) Nueva Ecija study and Marcineková et al.'s (2025) Slovak micro-enterprise case study, both discussed above, indicate that customers and small business owners alike evaluate chatbots primarily on functional suitability and response accuracy rather than novelty suggesting that a catalog-aware chatbot built specifically around Battlefront's product line could outperform generic platforms on the dimensions users care about most.</w:t>
-      </w:r>
-    </w:p>
-    <w:p>
-      <w:pPr>
-        <w:spacing w:before="240" w:after="240" w:line="480" w:lineRule="auto"/>
-        <w:rPr>
-          <w:rFonts w:ascii="Times New Roman" w:eastAsia="Times New Roman" w:hAnsi="Times New Roman" w:cs="Times New Roman"/>
-          <w:b/>
-          <w:sz w:val="24"/>
-          <w:szCs w:val="24"/>
-        </w:rPr>
-      </w:pPr>
-      <w:r>
-        <w:rPr>
-          <w:rFonts w:ascii="Times New Roman" w:eastAsia="Times New Roman" w:hAnsi="Times New Roman" w:cs="Times New Roman"/>
-          <w:b/>
-          <w:sz w:val="24"/>
-          <w:szCs w:val="24"/>
-        </w:rPr>
-        <w:t>Philippine-Based Prior Arts</w:t>
-      </w:r>
-    </w:p>
-    <w:p>
-      <w:pPr>
-        <w:spacing w:before="240" w:after="240" w:line="480" w:lineRule="auto"/>
-        <w:ind w:firstLine="720"/>
-        <w:jc w:val="both"/>
-        <w:rPr>
-          <w:rFonts w:ascii="Times New Roman" w:eastAsia="Times New Roman" w:hAnsi="Times New Roman" w:cs="Times New Roman"/>
-          <w:sz w:val="24"/>
-          <w:szCs w:val="24"/>
-        </w:rPr>
-      </w:pPr>
-      <w:r>
-        <w:rPr>
-          <w:rFonts w:ascii="Times New Roman" w:eastAsia="Times New Roman" w:hAnsi="Times New Roman" w:cs="Times New Roman"/>
-          <w:sz w:val="24"/>
-          <w:szCs w:val="24"/>
-        </w:rPr>
-        <w:t>Cordova et al.'s (2025) findings on Philippine MSME digital adoption, discussed above, further confirm that advanced, integrated digital tools remain rare among small Philippine trading businesses, reinforcing that a locally built, integrated system such as the one proposed here would fill a documented rather than assumed gap.</w:t>
-      </w:r>
-    </w:p>
-    <w:p>
-      <w:pPr>
-        <w:spacing w:before="240" w:after="240" w:line="480" w:lineRule="auto"/>
-        <w:rPr>
-          <w:rFonts w:ascii="Times New Roman" w:eastAsia="Times New Roman" w:hAnsi="Times New Roman" w:cs="Times New Roman"/>
-          <w:b/>
-          <w:sz w:val="24"/>
-          <w:szCs w:val="24"/>
-        </w:rPr>
-      </w:pPr>
-    </w:p>
-    <w:p>
-      <w:pPr>
-        <w:spacing w:before="240" w:after="240" w:line="480" w:lineRule="auto"/>
-        <w:rPr>
-          <w:rFonts w:ascii="Times New Roman" w:eastAsia="Times New Roman" w:hAnsi="Times New Roman" w:cs="Times New Roman"/>
-          <w:b/>
-          <w:sz w:val="24"/>
-          <w:szCs w:val="24"/>
-        </w:rPr>
-      </w:pPr>
-      <w:r>
-        <w:rPr>
-          <w:rFonts w:ascii="Times New Roman" w:eastAsia="Times New Roman" w:hAnsi="Times New Roman" w:cs="Times New Roman"/>
-          <w:b/>
-          <w:sz w:val="24"/>
-          <w:szCs w:val="24"/>
-        </w:rPr>
-        <w:t>Limitations of Current Systems</w:t>
-      </w:r>
-    </w:p>
-    <w:p>
-      <w:pPr>
-        <w:spacing w:before="240" w:after="240" w:line="480" w:lineRule="auto"/>
-        <w:ind w:firstLine="720"/>
-        <w:jc w:val="both"/>
-        <w:rPr>
-          <w:rFonts w:ascii="Times New Roman" w:eastAsia="Times New Roman" w:hAnsi="Times New Roman" w:cs="Times New Roman"/>
-          <w:sz w:val="24"/>
-          <w:szCs w:val="24"/>
-        </w:rPr>
-      </w:pPr>
-      <w:r>
-        <w:rPr>
-          <w:rFonts w:ascii="Times New Roman" w:eastAsia="Times New Roman" w:hAnsi="Times New Roman" w:cs="Times New Roman"/>
-          <w:sz w:val="24"/>
-          <w:szCs w:val="24"/>
-        </w:rPr>
-        <w:t xml:space="preserve">Taken together, these prior arts show that recommendation, forecasting, and chatbot capabilities have each been demonstrated locally and internationally, but no reviewed system, commercial or academic, combines even two of the three within a single Philippine computer hardware retail context, let alone all three. Samonte et al. (2022) combined recommendation with inventory but not forecasting or a chatbot; Arnaiz et al. (2023) and Franco et al. (2026) combined inventory with forecasting but not recommendation or a chatbot; Pastorfide and Vasquez (2025), Marcineková et al. </w:t>
-      </w:r>
-      <w:r>
-        <w:rPr>
-          <w:rFonts w:ascii="Times New Roman" w:eastAsia="Times New Roman" w:hAnsi="Times New Roman" w:cs="Times New Roman"/>
-          <w:sz w:val="24"/>
-          <w:szCs w:val="24"/>
-        </w:rPr>
-        <w:lastRenderedPageBreak/>
-        <w:t>(2025), and Panigrahi et al. (2023) evaluated chatbots in isolation from inventory or forecasting concerns. This gap directly motivates the proposed Integrated Web and Mobile Business Management System with Product Recommendation, Predictive Analytics, and Integrated Chatbot for Battlefront Computer Trading.</w:t>
+        <w:t>(2022) combined recommendation with inventory but not forecasting or a chatbot; Arnaiz et al. (2023) and Franco et al. (2026) combined inventory with forecasting but not recommendation or a chatbot; Pastorfide and Vasquez (2025), Marcineková et al. (2025), and Panigrahi et al. (2023) evaluated chatbots in isolation from inventory or forecasting concerns. This gap directly motivates the proposed Integrated Web and Mobile Business Management System with Product Recommendation, Predictive Analytics, and Integrated Chatbot for Battlefront Computer Trading.</w:t>
       </w:r>
     </w:p>
     <w:p>
@@ -6677,16 +6653,8 @@
           <w:sz w:val="24"/>
           <w:szCs w:val="24"/>
         </w:rPr>
-        <w:t xml:space="preserve">On product recommendation, the reviewed literature confirms that layering behavioral or review-derived signals on top of purchase data improves suggestion </w:t>
-      </w:r>
-      <w:r>
-        <w:rPr>
-          <w:rFonts w:ascii="Times New Roman" w:eastAsia="Times New Roman" w:hAnsi="Times New Roman" w:cs="Times New Roman"/>
-          <w:sz w:val="24"/>
-          <w:szCs w:val="24"/>
-        </w:rPr>
         <w:lastRenderedPageBreak/>
-        <w:t>relevance and cross-selling potential (Islek &amp; Oğuducu, 2022), and that Filipino-built systems have already validated pairing recommendation with inventory management at small-business scale (Samonte et al., 2022). Neither study, however, combines recommendation with forecasting or conversational support.</w:t>
+        <w:t>On product recommendation, the reviewed literature confirms that layering behavioral or review-derived signals on top of purchase data improves suggestion relevance and cross-selling potential (Islek &amp; Oğuducu, 2022), and that Filipino-built systems have already validated pairing recommendation with inventory management at small-business scale (Samonte et al., 2022). Neither study, however, combines recommendation with forecasting or conversational support.</w:t>
       </w:r>
     </w:p>
     <w:p>
@@ -6746,7 +6714,7 @@
           <w:sz w:val="24"/>
           <w:szCs w:val="24"/>
         </w:rPr>
-        <w:t xml:space="preserve">Methodologically, the reviewed literature also informs how the system should be built rather than only whether it is needed. Franco et al. (2026) demonstrate that lightweight, computationally inexpensive forecasting models can outperform more complex alternatives for resource-constrained enterprises, supporting this study's use of a similarly low-overhead approach moving average and linear trend regression rather </w:t>
+        <w:t xml:space="preserve">Methodologically, the reviewed literature also informs how the system should be built rather than only whether it is needed. Franco et al. (2026) demonstrate that lightweight, computationally inexpensive forecasting models can outperform more </w:t>
       </w:r>
       <w:r>
         <w:rPr>
@@ -6755,7 +6723,7 @@
           <w:szCs w:val="24"/>
         </w:rPr>
         <w:lastRenderedPageBreak/>
-        <w:t>than a heavier machine-learning model. Separately, Islek and Oğuducu (2022) demonstrate that layering behavioral signals onto purchase data improves recommendation relevance, but their review-inferred method requires interaction volume this study does not yet have; this reinforces, rather than supports adopting, the rule-based recommendation approach already justified in Chapter 1.</w:t>
+        <w:t>complex alternatives for resource-constrained enterprises, supporting this study's use of a similarly low-overhead approach based on a trailing four-quarter simple moving average rather than a heavier machine-learning model. Separately, Islek and Oğuducu (2022) demonstrate that layering behavioral signals onto purchase data improves recommendation relevance, but their review-inferred method requires interaction volume this study does not yet have; this reinforces, rather than supports adopting, the rule-based recommendation approach already justified in Chapter 1.</w:t>
       </w:r>
     </w:p>
     <w:p>
@@ -6994,7 +6962,7 @@
           <w:sz w:val="24"/>
           <w:szCs w:val="24"/>
         </w:rPr>
-        <w:t xml:space="preserve">This study will employ a descriptive-developmental research design to guide the design, development, and evaluation of an Integrated Web and Mobile Business Management System with Product Recommendation, Predictive Analytics, and Integrated Chatbot for Battlefront Computer Trading. The descriptive aspect will focus on analyzing existing sales, inventory, and customer service processes, while the developmental component will cover the actual design, implementation, and </w:t>
+        <w:t xml:space="preserve">This study will employ a descriptive-developmental research design to guide the design, development, and evaluation of an Integrated Web and Mobile Business Management System with Product Recommendation, Predictive Analytics, and Integrated Chatbot for Battlefront Computer Trading. The descriptive aspect will </w:t>
       </w:r>
       <w:r>
         <w:rPr>
@@ -7003,7 +6971,7 @@
           <w:szCs w:val="24"/>
         </w:rPr>
         <w:lastRenderedPageBreak/>
-        <w:t xml:space="preserve">testing of the recommendation engine, predictive analytics module, chatbot, and their integration into a functional web and mobile system. </w:t>
+        <w:t xml:space="preserve">focus on analyzing existing sales, inventory, and customer service processes, while the developmental component will cover the actual design, implementation, and testing of the recommendation engine, predictive analytics module, chatbot, and their integration into a functional web and mobile system. </w:t>
       </w:r>
     </w:p>
     <w:p>
@@ -7077,16 +7045,8 @@
           <w:sz w:val="24"/>
           <w:szCs w:val="24"/>
         </w:rPr>
-        <w:t xml:space="preserve">Given these considerations, the Sagay City Branch of Battlefront Computer Trading will serve as the primary setting for requirements gathering, system </w:t>
-      </w:r>
-      <w:r>
-        <w:rPr>
-          <w:rFonts w:ascii="Times New Roman" w:eastAsia="Times New Roman" w:hAnsi="Times New Roman" w:cs="Times New Roman"/>
-          <w:sz w:val="24"/>
-          <w:szCs w:val="24"/>
-        </w:rPr>
         <w:lastRenderedPageBreak/>
-        <w:t>deployment, and the testing and evaluation activities described in the succeeding sections of this chapter, consistent with the scope and delimitation stated in Chapter 1.</w:t>
+        <w:t>Given these considerations, the Sagay City Branch of Battlefront Computer Trading will serve as the primary setting for requirements gathering, system deployment, and the testing and evaluation activities described in the succeeding sections of this chapter, consistent with the scope and delimitation stated in Chapter 1.</w:t>
       </w:r>
     </w:p>
     <w:p>
@@ -7262,6 +7222,7 @@
           <w:sz w:val="24"/>
           <w:szCs w:val="24"/>
         </w:rPr>
+        <w:lastRenderedPageBreak/>
         <w:t>Requirements Phase</w:t>
       </w:r>
     </w:p>
@@ -7281,114 +7242,122 @@
           <w:sz w:val="24"/>
           <w:szCs w:val="24"/>
         </w:rPr>
+        <w:t>Initial meetings with the owner and staff of Battlefront Computer Trading will be conducted to identify user requirements, common customer inquiries, and system expectations. Data privacy and security considerations for storing customer and transaction information will also be addressed during this phase.</w:t>
+      </w:r>
+    </w:p>
+    <w:p>
+      <w:pPr>
+        <w:spacing w:line="480" w:lineRule="auto"/>
+        <w:ind w:firstLine="720"/>
+        <w:rPr>
+          <w:rFonts w:ascii="Times New Roman" w:eastAsia="Times New Roman" w:hAnsi="Times New Roman" w:cs="Times New Roman"/>
+          <w:b/>
+          <w:bCs/>
+          <w:sz w:val="24"/>
+          <w:szCs w:val="24"/>
+        </w:rPr>
+      </w:pPr>
+      <w:r>
+        <w:rPr>
+          <w:rFonts w:ascii="Times New Roman" w:eastAsia="Times New Roman" w:hAnsi="Times New Roman" w:cs="Times New Roman"/>
+          <w:b/>
+          <w:bCs/>
+          <w:sz w:val="24"/>
+          <w:szCs w:val="24"/>
+        </w:rPr>
+        <w:t>Historical Sales and Inventory Data Template</w:t>
+      </w:r>
+    </w:p>
+    <w:p>
+      <w:pPr>
+        <w:spacing w:line="480" w:lineRule="auto"/>
+        <w:ind w:firstLine="720"/>
+        <w:rPr>
+          <w:rFonts w:ascii="Times New Roman" w:eastAsia="Times New Roman" w:hAnsi="Times New Roman" w:cs="Times New Roman"/>
+          <w:sz w:val="24"/>
+          <w:szCs w:val="24"/>
+        </w:rPr>
+      </w:pPr>
+      <w:r>
+        <w:rPr>
+          <w:rFonts w:ascii="Times New Roman" w:eastAsia="Times New Roman" w:hAnsi="Times New Roman" w:cs="Times New Roman"/>
+          <w:sz w:val="24"/>
+          <w:szCs w:val="24"/>
+        </w:rPr>
+        <w:t>A data collection template will be developed to gather and organize relevant historical sales and inventory data from Battlefront Computer Trading’s records. The template will include variables such as product name, category, price, quantity sold, stock levels, and transaction dates. This structured dataset will serve as the input for developing the recommendation and predictive analytics modules. All customer-related data will be handled in compliance with the Data Privacy Act of 2012.</w:t>
+      </w:r>
+    </w:p>
+    <w:p>
+      <w:pPr>
+        <w:spacing w:line="480" w:lineRule="auto"/>
+        <w:ind w:firstLine="720"/>
+        <w:rPr>
+          <w:rFonts w:ascii="Times New Roman" w:eastAsia="Times New Roman" w:hAnsi="Times New Roman" w:cs="Times New Roman"/>
+          <w:sz w:val="24"/>
+          <w:szCs w:val="24"/>
+        </w:rPr>
+      </w:pPr>
+    </w:p>
+    <w:p>
+      <w:pPr>
+        <w:spacing w:line="480" w:lineRule="auto"/>
+        <w:ind w:firstLine="720"/>
+        <w:rPr>
+          <w:rFonts w:ascii="Times New Roman" w:eastAsia="Times New Roman" w:hAnsi="Times New Roman" w:cs="Times New Roman"/>
+          <w:sz w:val="24"/>
+          <w:szCs w:val="24"/>
+        </w:rPr>
+      </w:pPr>
+    </w:p>
+    <w:p>
+      <w:pPr>
+        <w:spacing w:line="480" w:lineRule="auto"/>
+        <w:ind w:firstLine="720"/>
+        <w:rPr>
+          <w:rFonts w:ascii="Times New Roman" w:eastAsia="Times New Roman" w:hAnsi="Times New Roman" w:cs="Times New Roman"/>
+          <w:b/>
+          <w:bCs/>
+          <w:sz w:val="24"/>
+          <w:szCs w:val="24"/>
+        </w:rPr>
+      </w:pPr>
+      <w:r>
+        <w:rPr>
+          <w:rFonts w:ascii="Times New Roman" w:eastAsia="Times New Roman" w:hAnsi="Times New Roman" w:cs="Times New Roman"/>
+          <w:b/>
+          <w:bCs/>
+          <w:sz w:val="24"/>
+          <w:szCs w:val="24"/>
+        </w:rPr>
+        <w:t>Data Collection and Preprocessing</w:t>
+      </w:r>
+    </w:p>
+    <w:p>
+      <w:pPr>
+        <w:spacing w:line="480" w:lineRule="auto"/>
+        <w:ind w:firstLine="720"/>
+        <w:rPr>
+          <w:rFonts w:ascii="Times New Roman" w:eastAsia="Times New Roman" w:hAnsi="Times New Roman" w:cs="Times New Roman"/>
+          <w:sz w:val="24"/>
+          <w:szCs w:val="24"/>
+        </w:rPr>
+      </w:pPr>
+      <w:r>
+        <w:rPr>
+          <w:rFonts w:ascii="Times New Roman" w:eastAsia="Times New Roman" w:hAnsi="Times New Roman" w:cs="Times New Roman"/>
+          <w:sz w:val="24"/>
+          <w:szCs w:val="24"/>
+        </w:rPr>
+        <w:t xml:space="preserve">Historical sales and inventory data will be collected, cleaned, and preprocessed. For forecasting, setup/import preparation will explicitly establish complete product-level coverage for the required four completed quarters. Covered quarters without transactions count as zero sales, including a valid all-zero estimate; shorter complete history produces an insufficient-history outcome, while unknown, incomplete, stale, or gapped coverage makes forecasting unavailable. Completeness will not be inferred solely from the earliest sale, product creation date, or generated zero buckets. Categorical data such as product categories will be encoded for use in </w:t>
+      </w:r>
+      <w:r>
+        <w:rPr>
+          <w:rFonts w:ascii="Times New Roman" w:eastAsia="Times New Roman" w:hAnsi="Times New Roman" w:cs="Times New Roman"/>
+          <w:sz w:val="24"/>
+          <w:szCs w:val="24"/>
+        </w:rPr>
         <w:lastRenderedPageBreak/>
-        <w:t>Initial meetings with the owner and staff of Battlefront Computer Trading will be conducted to identify user requirements, common customer inquiries, and system expectations. Data privacy and security considerations for storing customer and transaction information will also be addressed during this phase.</w:t>
-      </w:r>
-    </w:p>
-    <w:p>
-      <w:pPr>
-        <w:spacing w:line="480" w:lineRule="auto"/>
-        <w:ind w:firstLine="720"/>
-        <w:rPr>
-          <w:rFonts w:ascii="Times New Roman" w:eastAsia="Times New Roman" w:hAnsi="Times New Roman" w:cs="Times New Roman"/>
-          <w:b/>
-          <w:bCs/>
-          <w:sz w:val="24"/>
-          <w:szCs w:val="24"/>
-        </w:rPr>
-      </w:pPr>
-      <w:r>
-        <w:rPr>
-          <w:rFonts w:ascii="Times New Roman" w:eastAsia="Times New Roman" w:hAnsi="Times New Roman" w:cs="Times New Roman"/>
-          <w:b/>
-          <w:bCs/>
-          <w:sz w:val="24"/>
-          <w:szCs w:val="24"/>
-        </w:rPr>
-        <w:t>Historical Sales and Inventory Data Template</w:t>
-      </w:r>
-    </w:p>
-    <w:p>
-      <w:pPr>
-        <w:spacing w:line="480" w:lineRule="auto"/>
-        <w:ind w:firstLine="720"/>
-        <w:rPr>
-          <w:rFonts w:ascii="Times New Roman" w:eastAsia="Times New Roman" w:hAnsi="Times New Roman" w:cs="Times New Roman"/>
-          <w:sz w:val="24"/>
-          <w:szCs w:val="24"/>
-        </w:rPr>
-      </w:pPr>
-      <w:r>
-        <w:rPr>
-          <w:rFonts w:ascii="Times New Roman" w:eastAsia="Times New Roman" w:hAnsi="Times New Roman" w:cs="Times New Roman"/>
-          <w:sz w:val="24"/>
-          <w:szCs w:val="24"/>
-        </w:rPr>
-        <w:t>A data collection template will be developed to gather and organize relevant historical sales and inventory data from Battlefront Computer Trading’s records. The template will include variables such as product name, category, price, quantity sold, stock levels, and transaction dates. This structured dataset will serve as the input for developing the recommendation and predictive analytics modules. All customer-related data will be handled in compliance with the Data Privacy Act of 2012.</w:t>
-      </w:r>
-    </w:p>
-    <w:p>
-      <w:pPr>
-        <w:spacing w:line="480" w:lineRule="auto"/>
-        <w:ind w:firstLine="720"/>
-        <w:rPr>
-          <w:rFonts w:ascii="Times New Roman" w:eastAsia="Times New Roman" w:hAnsi="Times New Roman" w:cs="Times New Roman"/>
-          <w:sz w:val="24"/>
-          <w:szCs w:val="24"/>
-        </w:rPr>
-      </w:pPr>
-    </w:p>
-    <w:p>
-      <w:pPr>
-        <w:spacing w:line="480" w:lineRule="auto"/>
-        <w:ind w:firstLine="720"/>
-        <w:rPr>
-          <w:rFonts w:ascii="Times New Roman" w:eastAsia="Times New Roman" w:hAnsi="Times New Roman" w:cs="Times New Roman"/>
-          <w:sz w:val="24"/>
-          <w:szCs w:val="24"/>
-        </w:rPr>
-      </w:pPr>
-    </w:p>
-    <w:p>
-      <w:pPr>
-        <w:spacing w:line="480" w:lineRule="auto"/>
-        <w:ind w:firstLine="720"/>
-        <w:rPr>
-          <w:rFonts w:ascii="Times New Roman" w:eastAsia="Times New Roman" w:hAnsi="Times New Roman" w:cs="Times New Roman"/>
-          <w:b/>
-          <w:bCs/>
-          <w:sz w:val="24"/>
-          <w:szCs w:val="24"/>
-        </w:rPr>
-      </w:pPr>
-      <w:r>
-        <w:rPr>
-          <w:rFonts w:ascii="Times New Roman" w:eastAsia="Times New Roman" w:hAnsi="Times New Roman" w:cs="Times New Roman"/>
-          <w:b/>
-          <w:bCs/>
-          <w:sz w:val="24"/>
-          <w:szCs w:val="24"/>
-        </w:rPr>
-        <w:t>Data Collection and Preprocessing</w:t>
-      </w:r>
-    </w:p>
-    <w:p>
-      <w:pPr>
-        <w:spacing w:line="480" w:lineRule="auto"/>
-        <w:ind w:firstLine="720"/>
-        <w:rPr>
-          <w:rFonts w:ascii="Times New Roman" w:eastAsia="Times New Roman" w:hAnsi="Times New Roman" w:cs="Times New Roman"/>
-          <w:sz w:val="24"/>
-          <w:szCs w:val="24"/>
-        </w:rPr>
-      </w:pPr>
-      <w:r>
-        <w:rPr>
-          <w:rFonts w:ascii="Times New Roman" w:eastAsia="Times New Roman" w:hAnsi="Times New Roman" w:cs="Times New Roman"/>
-          <w:sz w:val="24"/>
-          <w:szCs w:val="24"/>
-        </w:rPr>
-        <w:t>Historical sales and inventory data will be collected, cleaned, and preprocessed. Missing values will be handled appropriately, and categorical data such as product categories will be encoded for use in the recommendation and forecasting models. This structured dataset will form the basis for model development and evaluation.</w:t>
+        <w:t>recommendation models; they are not predictors in the moving-average calculation. This structured dataset will form the basis for model development and evaluation.</w:t>
       </w:r>
     </w:p>
     <w:p>
@@ -7490,7 +7459,135 @@
           <w:sz w:val="24"/>
           <w:szCs w:val="24"/>
         </w:rPr>
-        <w:t xml:space="preserve">The proposed system will be assessed in terms of the time available for its development, testing, and deployment. The project will follow the adopted Software Development Life Cycle (SDLC) with Agile methodology, ensuring that tasks are </w:t>
+        <w:t>The proposed system will be assessed in terms of the time available for its development, testing, and deployment. The project will follow the adopted Software Development Life Cycle (SDLC) with Agile methodology, ensuring that tasks are divided into manageable sprints and milestones. Each phase from requirements gathering, design, development, testing, to implementation will be aligned with the academic calendar and the research timeline set by the researchers. Given the availability of resources, tools, and manpower, the researchers determined that the system can be completed within the prescribed period without compromising quality.</w:t>
+      </w:r>
+    </w:p>
+    <w:p>
+      <w:pPr>
+        <w:spacing w:line="480" w:lineRule="auto"/>
+        <w:jc w:val="both"/>
+        <w:rPr>
+          <w:rFonts w:ascii="Times New Roman" w:eastAsia="Times New Roman" w:hAnsi="Times New Roman" w:cs="Times New Roman"/>
+          <w:noProof/>
+          <w:sz w:val="24"/>
+          <w:szCs w:val="24"/>
+        </w:rPr>
+      </w:pPr>
+    </w:p>
+    <w:p>
+      <w:pPr>
+        <w:spacing w:line="480" w:lineRule="auto"/>
+        <w:ind w:firstLine="720"/>
+        <w:jc w:val="both"/>
+        <w:rPr>
+          <w:rFonts w:ascii="Times New Roman" w:eastAsia="Times New Roman" w:hAnsi="Times New Roman" w:cs="Times New Roman"/>
+          <w:noProof/>
+          <w:sz w:val="24"/>
+          <w:szCs w:val="24"/>
+        </w:rPr>
+      </w:pPr>
+    </w:p>
+    <w:p>
+      <w:pPr>
+        <w:spacing w:line="480" w:lineRule="auto"/>
+        <w:ind w:firstLine="720"/>
+        <w:jc w:val="both"/>
+        <w:rPr>
+          <w:rFonts w:ascii="Times New Roman" w:eastAsia="Times New Roman" w:hAnsi="Times New Roman" w:cs="Times New Roman"/>
+          <w:noProof/>
+          <w:sz w:val="24"/>
+          <w:szCs w:val="24"/>
+        </w:rPr>
+      </w:pPr>
+    </w:p>
+    <w:p>
+      <w:pPr>
+        <w:spacing w:line="480" w:lineRule="auto"/>
+        <w:ind w:firstLine="720"/>
+        <w:jc w:val="both"/>
+        <w:rPr>
+          <w:rFonts w:ascii="Times New Roman" w:eastAsia="Times New Roman" w:hAnsi="Times New Roman" w:cs="Times New Roman"/>
+          <w:noProof/>
+          <w:sz w:val="24"/>
+          <w:szCs w:val="24"/>
+        </w:rPr>
+      </w:pPr>
+    </w:p>
+    <w:p>
+      <w:pPr>
+        <w:spacing w:line="480" w:lineRule="auto"/>
+        <w:ind w:firstLine="720"/>
+        <w:jc w:val="both"/>
+        <w:rPr>
+          <w:rFonts w:ascii="Times New Roman" w:eastAsia="Times New Roman" w:hAnsi="Times New Roman" w:cs="Times New Roman"/>
+          <w:noProof/>
+          <w:sz w:val="24"/>
+          <w:szCs w:val="24"/>
+        </w:rPr>
+      </w:pPr>
+    </w:p>
+    <w:p>
+      <w:pPr>
+        <w:spacing w:line="480" w:lineRule="auto"/>
+        <w:ind w:firstLine="720"/>
+        <w:jc w:val="both"/>
+        <w:rPr>
+          <w:rFonts w:ascii="Times New Roman" w:eastAsia="Times New Roman" w:hAnsi="Times New Roman" w:cs="Times New Roman"/>
+          <w:noProof/>
+          <w:sz w:val="24"/>
+          <w:szCs w:val="24"/>
+        </w:rPr>
+      </w:pPr>
+    </w:p>
+    <w:p>
+      <w:pPr>
+        <w:spacing w:line="480" w:lineRule="auto"/>
+        <w:ind w:firstLine="720"/>
+        <w:jc w:val="both"/>
+        <w:rPr>
+          <w:rFonts w:ascii="Times New Roman" w:eastAsia="Times New Roman" w:hAnsi="Times New Roman" w:cs="Times New Roman"/>
+          <w:noProof/>
+          <w:sz w:val="24"/>
+          <w:szCs w:val="24"/>
+        </w:rPr>
+      </w:pPr>
+    </w:p>
+    <w:p>
+      <w:pPr>
+        <w:spacing w:line="480" w:lineRule="auto"/>
+        <w:jc w:val="center"/>
+        <w:rPr>
+          <w:rFonts w:ascii="Times New Roman" w:eastAsia="Times New Roman" w:hAnsi="Times New Roman" w:cs="Times New Roman"/>
+          <w:sz w:val="24"/>
+          <w:szCs w:val="24"/>
+        </w:rPr>
+      </w:pPr>
+      <w:r>
+        <w:rPr>
+          <w:rFonts w:ascii="Times New Roman" w:eastAsia="Times New Roman" w:hAnsi="Times New Roman" w:cs="Times New Roman"/>
+          <w:sz w:val="24"/>
+          <w:szCs w:val="24"/>
+        </w:rPr>
+        <w:t>Fig. 3. Gantt chart</w:t>
+      </w:r>
+    </w:p>
+    <w:p>
+      <w:pPr>
+        <w:spacing w:line="480" w:lineRule="auto"/>
+        <w:ind w:firstLine="720"/>
+        <w:rPr>
+          <w:rFonts w:ascii="Times New Roman" w:eastAsia="Times New Roman" w:hAnsi="Times New Roman" w:cs="Times New Roman"/>
+          <w:sz w:val="24"/>
+          <w:szCs w:val="24"/>
+        </w:rPr>
+      </w:pPr>
+      <w:r>
+        <w:rPr>
+          <w:rFonts w:ascii="Times New Roman" w:eastAsia="Times New Roman" w:hAnsi="Times New Roman" w:cs="Times New Roman"/>
+          <w:sz w:val="24"/>
+          <w:szCs w:val="24"/>
+        </w:rPr>
+        <w:t xml:space="preserve">As illustrated in the Gantt chart above, the phases of the project including requirements gathering, system design, development of the recommendation and predictive analytics modules, chatbot integration, testing, and deployment are distributed across the academic semester to ensure balanced workload and timely </w:t>
       </w:r>
       <w:r>
         <w:rPr>
@@ -7499,135 +7596,7 @@
           <w:szCs w:val="24"/>
         </w:rPr>
         <w:lastRenderedPageBreak/>
-        <w:t>divided into manageable sprints and milestones. Each phase from requirements gathering, design, development, testing, to implementation will be aligned with the academic calendar and the research timeline set by the researchers. Given the availability of resources, tools, and manpower, the researchers determined that the system can be completed within the prescribed period without compromising quality.</w:t>
-      </w:r>
-    </w:p>
-    <w:p>
-      <w:pPr>
-        <w:spacing w:line="480" w:lineRule="auto"/>
-        <w:jc w:val="both"/>
-        <w:rPr>
-          <w:rFonts w:ascii="Times New Roman" w:eastAsia="Times New Roman" w:hAnsi="Times New Roman" w:cs="Times New Roman"/>
-          <w:noProof/>
-          <w:sz w:val="24"/>
-          <w:szCs w:val="24"/>
-        </w:rPr>
-      </w:pPr>
-    </w:p>
-    <w:p>
-      <w:pPr>
-        <w:spacing w:line="480" w:lineRule="auto"/>
-        <w:ind w:firstLine="720"/>
-        <w:jc w:val="both"/>
-        <w:rPr>
-          <w:rFonts w:ascii="Times New Roman" w:eastAsia="Times New Roman" w:hAnsi="Times New Roman" w:cs="Times New Roman"/>
-          <w:noProof/>
-          <w:sz w:val="24"/>
-          <w:szCs w:val="24"/>
-        </w:rPr>
-      </w:pPr>
-    </w:p>
-    <w:p>
-      <w:pPr>
-        <w:spacing w:line="480" w:lineRule="auto"/>
-        <w:ind w:firstLine="720"/>
-        <w:jc w:val="both"/>
-        <w:rPr>
-          <w:rFonts w:ascii="Times New Roman" w:eastAsia="Times New Roman" w:hAnsi="Times New Roman" w:cs="Times New Roman"/>
-          <w:noProof/>
-          <w:sz w:val="24"/>
-          <w:szCs w:val="24"/>
-        </w:rPr>
-      </w:pPr>
-    </w:p>
-    <w:p>
-      <w:pPr>
-        <w:spacing w:line="480" w:lineRule="auto"/>
-        <w:ind w:firstLine="720"/>
-        <w:jc w:val="both"/>
-        <w:rPr>
-          <w:rFonts w:ascii="Times New Roman" w:eastAsia="Times New Roman" w:hAnsi="Times New Roman" w:cs="Times New Roman"/>
-          <w:noProof/>
-          <w:sz w:val="24"/>
-          <w:szCs w:val="24"/>
-        </w:rPr>
-      </w:pPr>
-    </w:p>
-    <w:p>
-      <w:pPr>
-        <w:spacing w:line="480" w:lineRule="auto"/>
-        <w:ind w:firstLine="720"/>
-        <w:jc w:val="both"/>
-        <w:rPr>
-          <w:rFonts w:ascii="Times New Roman" w:eastAsia="Times New Roman" w:hAnsi="Times New Roman" w:cs="Times New Roman"/>
-          <w:noProof/>
-          <w:sz w:val="24"/>
-          <w:szCs w:val="24"/>
-        </w:rPr>
-      </w:pPr>
-    </w:p>
-    <w:p>
-      <w:pPr>
-        <w:spacing w:line="480" w:lineRule="auto"/>
-        <w:ind w:firstLine="720"/>
-        <w:jc w:val="both"/>
-        <w:rPr>
-          <w:rFonts w:ascii="Times New Roman" w:eastAsia="Times New Roman" w:hAnsi="Times New Roman" w:cs="Times New Roman"/>
-          <w:noProof/>
-          <w:sz w:val="24"/>
-          <w:szCs w:val="24"/>
-        </w:rPr>
-      </w:pPr>
-    </w:p>
-    <w:p>
-      <w:pPr>
-        <w:spacing w:line="480" w:lineRule="auto"/>
-        <w:ind w:firstLine="720"/>
-        <w:jc w:val="both"/>
-        <w:rPr>
-          <w:rFonts w:ascii="Times New Roman" w:eastAsia="Times New Roman" w:hAnsi="Times New Roman" w:cs="Times New Roman"/>
-          <w:noProof/>
-          <w:sz w:val="24"/>
-          <w:szCs w:val="24"/>
-        </w:rPr>
-      </w:pPr>
-    </w:p>
-    <w:p>
-      <w:pPr>
-        <w:spacing w:line="480" w:lineRule="auto"/>
-        <w:jc w:val="center"/>
-        <w:rPr>
-          <w:rFonts w:ascii="Times New Roman" w:eastAsia="Times New Roman" w:hAnsi="Times New Roman" w:cs="Times New Roman"/>
-          <w:sz w:val="24"/>
-          <w:szCs w:val="24"/>
-        </w:rPr>
-      </w:pPr>
-      <w:r>
-        <w:rPr>
-          <w:rFonts w:ascii="Times New Roman" w:eastAsia="Times New Roman" w:hAnsi="Times New Roman" w:cs="Times New Roman"/>
-          <w:sz w:val="24"/>
-          <w:szCs w:val="24"/>
-        </w:rPr>
-        <w:t>Fig. 3. Gantt chart</w:t>
-      </w:r>
-    </w:p>
-    <w:p>
-      <w:pPr>
-        <w:spacing w:line="480" w:lineRule="auto"/>
-        <w:ind w:firstLine="720"/>
-        <w:rPr>
-          <w:rFonts w:ascii="Times New Roman" w:eastAsia="Times New Roman" w:hAnsi="Times New Roman" w:cs="Times New Roman"/>
-          <w:sz w:val="24"/>
-          <w:szCs w:val="24"/>
-        </w:rPr>
-      </w:pPr>
-      <w:r>
-        <w:rPr>
-          <w:rFonts w:ascii="Times New Roman" w:eastAsia="Times New Roman" w:hAnsi="Times New Roman" w:cs="Times New Roman"/>
-          <w:sz w:val="24"/>
-          <w:szCs w:val="24"/>
-        </w:rPr>
-        <w:t>As illustrated in the Gantt chart above, the phases of the project including requirements gathering, system design, development of the recommendation and predictive analytics modules, chatbot integration, testing, and deployment are distributed across the academic semester to ensure balanced workload and timely completion, with each sprint focused on specific deliverables to allow iterative progress and early detection of issues. Therefore, the project is considered feasible in terms of schedule.</w:t>
+        <w:t>completion, with each sprint focused on specific deliverables to allow iterative progress and early detection of issues. Therefore, the project is considered feasible in terms of schedule.</w:t>
       </w:r>
     </w:p>
     <w:p>
@@ -7666,16 +7635,7 @@
           <w:sz w:val="24"/>
           <w:szCs w:val="24"/>
         </w:rPr>
-        <w:t xml:space="preserve">Economic feasibility evaluates whether the proposed system can be developed and implemented at a reasonable cost while ensuring that the expected benefits </w:t>
-      </w:r>
-      <w:r>
-        <w:rPr>
-          <w:rFonts w:ascii="Times New Roman" w:eastAsia="Times New Roman" w:hAnsi="Times New Roman" w:cs="Times New Roman"/>
-          <w:sz w:val="24"/>
-          <w:szCs w:val="24"/>
-        </w:rPr>
-        <w:lastRenderedPageBreak/>
-        <w:t>outweigh the projected expenses. To support this, the researchers prepared a cost-benefit analysis (CBA) that highlights both the initial and recurring costs of the project in comparison to its anticipated operational and strategic benefits for Battlefront Computer Trading.</w:t>
+        <w:t>Economic feasibility evaluates whether the proposed system can be developed and implemented at a reasonable cost while ensuring that the expected benefits outweigh the projected expenses. To support this, the researchers prepared a cost-benefit analysis (CBA) that highlights both the initial and recurring costs of the project in comparison to its anticipated operational and strategic benefits for Battlefront Computer Trading.</w:t>
       </w:r>
     </w:p>
     <w:p>
@@ -8054,8 +8014,16 @@
           <w:sz w:val="24"/>
           <w:szCs w:val="24"/>
         </w:rPr>
+        <w:t xml:space="preserve">As shown in Table 2 and Fig. 4, the system requires an initial implementation cost of ₱120,000 in Year 0, with operational costs starting at ₱25,000 in Year 1 and increasing by approximately 5% annually to account for ongoing hosting, maintenance, and support, reaching ₱30,388 by Year 5. On the benefit side, the system is projected to generate ₱70,000 in Year 1, growing by roughly 8% annually as adoption increases and reaching ₱95,234 by Year 5, driven by reduced manual workload, minimized stockouts through better demand forecasting, increased cross-selling through product recommendations, and improved customer response time through the chatbot. When both cost and benefit streams are adjusted for the time value of money at a 10% discount rate, the cumulative time-adjusted benefit overtakes the cumulative time-adjusted cost between Year 2 and Year 3, resulting in a payback period of 2.9 years. Over the 5-year horizon, the project yields a Net Present Value (NPV) of ₱83,013 and, using the same time-adjusted (discounted) cost and benefit streams, a Return on Investment (ROI) of 37.1%, computed as NPV divided by the discounted total cost of ₱223,765. The 5% annual increase in operational costs, 8% annual growth in benefits, and 10% discount rate used in this analysis are researcher-formulated assumptions intended for initial project planning and feasibility </w:t>
+      </w:r>
+      <w:r>
+        <w:rPr>
+          <w:rFonts w:ascii="Times New Roman" w:eastAsia="Times New Roman" w:hAnsi="Times New Roman" w:cs="Times New Roman"/>
+          <w:sz w:val="24"/>
+          <w:szCs w:val="24"/>
+        </w:rPr>
         <w:lastRenderedPageBreak/>
-        <w:t>As shown in Table 2 and Fig. 4, the system requires an initial implementation cost of ₱120,000 in Year 0, with operational costs starting at ₱25,000 in Year 1 and increasing by approximately 5% annually to account for ongoing hosting, maintenance, and support, reaching ₱30,388 by Year 5. On the benefit side, the system is projected to generate ₱70,000 in Year 1, growing by roughly 8% annually as adoption increases and reaching ₱95,234 by Year 5, driven by reduced manual workload, minimized stockouts through better demand forecasting, increased cross-selling through product recommendations, and improved customer response time through the chatbot. When both cost and benefit streams are adjusted for the time value of money at a 10% discount rate, the cumulative time-adjusted benefit overtakes the cumulative time-adjusted cost between Year 2 and Year 3, resulting in a payback period of 2.9 years. Over the 5-year horizon, the project yields a Net Present Value (NPV) of ₱83,013 and, using the same time-adjusted (discounted) cost and benefit streams, a Return on Investment (ROI) of 37.1%, computed as NPV divided by the discounted total cost of ₱223,765. The 5% annual increase in operational costs, 8% annual growth in benefits, and 10% discount rate used in this analysis are researcher-formulated assumptions intended for initial project planning and feasibility estimation, rather than figures derived from Battlefront Computer Trading's actual historical financial data.</w:t>
+        <w:t>estimation, rather than figures derived from Battlefront Computer Trading's actual historical financial data.</w:t>
       </w:r>
     </w:p>
     <w:p>
@@ -8133,39 +8101,45 @@
           <w:sz w:val="24"/>
           <w:szCs w:val="24"/>
         </w:rPr>
+        <w:t>Intelligent Module Design</w:t>
+      </w:r>
+      <w:r>
+        <w:rPr>
+          <w:rFonts w:ascii="Times New Roman" w:eastAsia="Times New Roman" w:hAnsi="Times New Roman" w:cs="Times New Roman"/>
+          <w:b/>
+          <w:sz w:val="24"/>
+          <w:szCs w:val="24"/>
+        </w:rPr>
+        <w:tab/>
+      </w:r>
+      <w:r>
+        <w:rPr>
+          <w:rFonts w:ascii="Times New Roman" w:eastAsia="Times New Roman" w:hAnsi="Times New Roman" w:cs="Times New Roman"/>
+          <w:b/>
+          <w:sz w:val="24"/>
+          <w:szCs w:val="24"/>
+        </w:rPr>
+        <w:tab/>
+      </w:r>
+    </w:p>
+    <w:p>
+      <w:pPr>
+        <w:pStyle w:val="NormalWeb"/>
+        <w:spacing w:line="480" w:lineRule="auto"/>
+        <w:ind w:firstLine="720"/>
+      </w:pPr>
+      <w:r>
+        <w:rPr>
+          <w:lang w:val="en"/>
+        </w:rPr>
+        <w:t xml:space="preserve">The recommendation and predictive analytics modules will be designed using deterministic business logic to ensure consistent, maintainable, and cost-effective operation. The product recommendation module employs rule-based filtering to generate recommendations based on customer-defined criteria such as budget, intended use, preferred brand, product category, and product tags. The predictive analytics module uses one trailing four-quarter simple moving average of covered historical product unit sales to estimate quarterly demand. It automatically selects the four most recent completed calendar quarters, excludes the incomplete target quarter, and forecasts the full quarter beginning at the current quarter boundary. Administrators select a product and generate its estimate; no method choice, manual history-start selection, or repeated coverage-confirmation checkbox is required. Data readiness is established during setup/import preparation, and current inventory remains separate planning context. The chatbot module applies the same deterministic approach only to query categorization, classifying customer queries into supported inquiry types and retrieving relevant information from the system database; the response text itself is then generated by the Gemini 2.5 Flash API, a generative </w:t>
+      </w:r>
+      <w:r>
+        <w:rPr>
+          <w:lang w:val="en"/>
+        </w:rPr>
         <w:lastRenderedPageBreak/>
-        <w:t>Intelligent Module Design</w:t>
-      </w:r>
-      <w:r>
-        <w:rPr>
-          <w:rFonts w:ascii="Times New Roman" w:eastAsia="Times New Roman" w:hAnsi="Times New Roman" w:cs="Times New Roman"/>
-          <w:b/>
-          <w:sz w:val="24"/>
-          <w:szCs w:val="24"/>
-        </w:rPr>
-        <w:tab/>
-      </w:r>
-      <w:r>
-        <w:rPr>
-          <w:rFonts w:ascii="Times New Roman" w:eastAsia="Times New Roman" w:hAnsi="Times New Roman" w:cs="Times New Roman"/>
-          <w:b/>
-          <w:sz w:val="24"/>
-          <w:szCs w:val="24"/>
-        </w:rPr>
-        <w:tab/>
-      </w:r>
-    </w:p>
-    <w:p>
-      <w:pPr>
-        <w:pStyle w:val="NormalWeb"/>
-        <w:spacing w:line="480" w:lineRule="auto"/>
-        <w:ind w:firstLine="720"/>
-      </w:pPr>
-      <w:r>
-        <w:rPr>
-          <w:lang w:val="en"/>
-        </w:rPr>
-        <w:t>The recommendation and predictive analytics modules will be designed using deterministic business logic to ensure consistent, maintainable, and cost-effective operation. The product recommendation module employs rule-based filtering to generate recommendations based on customer-defined criteria such as budget, intended use, preferred brand, product category, and product tags. The predictive analytics module utilizes historical sales and inventory data, aggregated on a quarterly basis, together with moving average and linear trend regression techniques to estimate future product demand and identify sales trends that support inventory planning and business decision-making. The chatbot module applies the same deterministic approach only to query categorization, classifying customer queries into supported inquiry types and retrieving relevant information from the system database; the response text itself is then generated by the Gemini 2.5 Flash API, a generative language model, using that retrieved context, so its final wording is not deterministic or rule-based even though the categorization and retrieval steps that ground it are.</w:t>
+        <w:t>language model, using that retrieved context, so its final wording is not deterministic or rule-based even though the categorization and retrieval steps that ground it are.</w:t>
       </w:r>
     </w:p>
     <w:p>
@@ -8246,7 +8220,7 @@
           <w:sz w:val="24"/>
           <w:szCs w:val="24"/>
         </w:rPr>
-        <w:t xml:space="preserve"> – Organizes historical sales and inventory records into quarterly intervals to identify demand patterns for forecasting. </w:t>
+        <w:t xml:space="preserve"> – Organizes covered product unit sales into the four most recent completed calendar quarters, preserving valid zero-sales observations. Current inventory is separate operational context. </w:t>
       </w:r>
     </w:p>
     <w:p>
@@ -8270,7 +8244,6 @@
           <w:sz w:val="24"/>
           <w:szCs w:val="24"/>
         </w:rPr>
-        <w:lastRenderedPageBreak/>
         <w:t xml:space="preserve">Moving Average </w:t>
       </w:r>
       <w:r>
@@ -8279,7 +8252,7 @@
           <w:sz w:val="24"/>
           <w:szCs w:val="24"/>
         </w:rPr>
-        <w:t xml:space="preserve">– Computes the average product demand over a defined number of recent quarters to smooth short-term fluctuations and establish a stable reference baseline. </w:t>
+        <w:t xml:space="preserve">– Sums product units sold in the four most recent completed calendar quarters and divides by four, producing a deterministic two-decimal demand estimate for the full quarter beginning at the current quarter boundary. The incomplete target quarter is excluded. </w:t>
       </w:r>
     </w:p>
     <w:p>
@@ -8305,7 +8278,7 @@
           <w:sz w:val="24"/>
           <w:szCs w:val="24"/>
         </w:rPr>
-        <w:t xml:space="preserve">Trend Analysis (Linear Regression) </w:t>
+        <w:t xml:space="preserve">Forecasting Readiness </w:t>
       </w:r>
       <w:r>
         <w:rPr>
@@ -8313,7 +8286,7 @@
           <w:sz w:val="24"/>
           <w:szCs w:val="24"/>
         </w:rPr>
-        <w:t>– Applies least-squares linear regression on historical quarterly sales data to project future product demand for the upcoming quarter, supporting inventory planning.</w:t>
+        <w:t>– Uses explicit setup/import coverage metadata to distinguish complete four-quarter history from insufficient or unavailable history before treating empty quarters as zero. Forecast persistence remains product-focused, retaining the existing method field for compatibility and replacing results by product, method, and target quarter; new production forecasts use moving_average only.</w:t>
       </w:r>
     </w:p>
     <w:p>
@@ -8365,6 +8338,7 @@
           <w:sz w:val="24"/>
           <w:szCs w:val="24"/>
         </w:rPr>
+        <w:lastRenderedPageBreak/>
         <w:drawing>
           <wp:anchor distT="0" distB="0" distL="114300" distR="114300" simplePos="0" relativeHeight="251662336" behindDoc="0" locked="0" layoutInCell="1" allowOverlap="1" wp14:anchorId="30DC392E" wp14:editId="0B8A6937">
             <wp:simplePos x="0" y="0"/>
@@ -8516,7 +8490,7 @@
           <w:sz w:val="24"/>
           <w:szCs w:val="24"/>
         </w:rPr>
-        <w:t xml:space="preserve">Figure 5 presents the Data Flow Diagram (DFD) of the proposed system, illustrating how data moves between external entities, system processes, and data </w:t>
+        <w:t xml:space="preserve">Figure 5 presents the Data Flow Diagram (DFD) of the proposed system, illustrating how data moves between external entities, system processes, and data stores. The diagram depicts the primary business processes, including user authentication, product management, inventory management, order processing, product recommendation generation, sales forecasting, report generation, and chatbot services, together with the corresponding data exchanged throughout the system. It demonstrates how customer and administrator requests are processed, stored, and retrieved to support the system's core functionalities. Furthermore, the DFD serves as a blueprint for understanding the interaction among system components, ensuring proper data flow, consistency, and integrity during system operation. Overall, Figure </w:t>
       </w:r>
       <w:r>
         <w:rPr>
@@ -8525,7 +8499,7 @@
           <w:szCs w:val="24"/>
         </w:rPr>
         <w:lastRenderedPageBreak/>
-        <w:t>stores. The diagram depicts the primary business processes, including user authentication, product management, inventory management, order processing, product recommendation generation, sales forecasting, report generation, and chatbot services, together with the corresponding data exchanged throughout the system. It demonstrates how customer and administrator requests are processed, stored, and retrieved to support the system's core functionalities. Furthermore, the DFD serves as a blueprint for understanding the interaction among system components, ensuring proper data flow, consistency, and integrity during system operation. Overall, Figure 5 provides a clear representation of how the proposed system manages and processes information to achieve its intended objectives.</w:t>
+        <w:t>5 provides a clear representation of how the proposed system manages and processes information to achieve its intended objectives.</w:t>
       </w:r>
     </w:p>
     <w:p>
@@ -8616,8 +8590,16 @@
           <w:sz w:val="24"/>
           <w:szCs w:val="24"/>
         </w:rPr>
+        <w:t xml:space="preserve">Figure 6 illustrates the logical structure of the proposed system's database by presenting the entities, their attributes, and the relationships among them. It serves as the blueprint for organizing and managing data while ensuring consistency, integrity, and efficient data retrieval throughout the system. The diagram includes core entities such as Users, Branches, Categories, Products, Tags, Inventory, Carts, Cart Items, Orders, Order Items, Sales, Forecasts, and Chatbot Knowledge, which collectively support the system's business processes and information flow. The database is designed using a normalized relational structure to minimize data redundancy and </w:t>
+      </w:r>
+      <w:r>
+        <w:rPr>
+          <w:rFonts w:ascii="Times New Roman" w:eastAsia="Times New Roman" w:hAnsi="Times New Roman" w:cs="Times New Roman"/>
+          <w:sz w:val="24"/>
+          <w:szCs w:val="24"/>
+        </w:rPr>
         <w:lastRenderedPageBreak/>
-        <w:t>Figure 6 illustrates the logical structure of the proposed system's database by presenting the entities, their attributes, and the relationships among them. It serves as the blueprint for organizing and managing data while ensuring consistency, integrity, and efficient data retrieval throughout the system. The diagram includes core entities such as Users, Branches, Categories, Products, Tags, Inventory, Carts, Cart Items, Orders, Order Items, Sales, Forecasts, and Chatbot Knowledge, which collectively support the system's business processes and information flow. The database is designed using a normalized relational structure to minimize data redundancy and maintain data integrity. Overall, the Entity-Relationship Diagram provides the foundation for implementing the proposed Integrated Web and Mobile Business Management System by supporting product and inventory management, customer ordering, sales monitoring, predictive analytics, and chatbot knowledge management.</w:t>
+        <w:t>maintain data integrity. Overall, the Entity-Relationship Diagram provides the foundation for implementing the proposed Integrated Web and Mobile Business Management System by supporting product and inventory management, customer ordering, sales monitoring, predictive analytics, and chatbot knowledge management.</w:t>
       </w:r>
     </w:p>
     <w:p>
@@ -8640,7 +8622,6 @@
           <w:sz w:val="22"/>
           <w:szCs w:val="22"/>
         </w:rPr>
-        <w:lastRenderedPageBreak/>
         <w:drawing>
           <wp:anchor distT="0" distB="0" distL="114300" distR="114300" simplePos="0" relativeHeight="251664384" behindDoc="0" locked="0" layoutInCell="1" allowOverlap="1" wp14:anchorId="4C3B695F" wp14:editId="1E4646E4">
             <wp:simplePos x="0" y="0"/>
@@ -8744,17 +8725,9 @@
           <w:sz w:val="24"/>
           <w:szCs w:val="24"/>
         </w:rPr>
+        <w:lastRenderedPageBreak/>
         <w:tab/>
-        <w:t xml:space="preserve">Figure 7 presents the Use Case Diagram of the proposed Battlefront Computer Trading Management System. The diagram illustrates the interactions between the two primary actors, the Customer and the Administrator, and the system's major functional requirements. Customers can register, authenticate, manage their profile, </w:t>
-      </w:r>
-      <w:r>
-        <w:rPr>
-          <w:rFonts w:ascii="Times New Roman" w:eastAsia="Times New Roman" w:hAnsi="Times New Roman" w:cs="Times New Roman"/>
-          <w:sz w:val="24"/>
-          <w:szCs w:val="24"/>
-        </w:rPr>
-        <w:lastRenderedPageBreak/>
-        <w:t>browse, search, and filter products, view product details, receive product recommendations, manage their shopping cart, place and track orders, view order history, access chatbot services, and view branch information. Administrators are responsible for managing products, categories, inventory, orders, sales, customer accounts, chatbot knowledge, and branch information, generating sales forecasts and business reports, and monitoring overall system activity through the administrative dashboard. The diagram provides a high-level representation of the system's functional scope and serves as a blueprint for defining user interactions and system behavior during development.</w:t>
+        <w:t>Figure 7 presents the Use Case Diagram of the proposed Battlefront Computer Trading Management System. The diagram illustrates the interactions between the two primary actors, the Customer and the Administrator, and the system's major functional requirements. Customers can register, authenticate, manage their profile, browse, search, and filter products, view product details, receive product recommendations, manage their shopping cart, place and track orders, view order history, access chatbot services, and view branch information. Administrators are responsible for managing products, categories, inventory, orders, sales, customer accounts, chatbot knowledge, and branch information, generating sales forecasts and business reports, and monitoring overall system activity through the administrative dashboard. The diagram provides a high-level representation of the system's functional scope and serves as a blueprint for defining user interactions and system behavior during development.</w:t>
       </w:r>
     </w:p>
     <w:p>
@@ -8971,7 +8944,7 @@
           <w:szCs w:val="24"/>
         </w:rPr>
         <w:lastRenderedPageBreak/>
-        <w:t>with the Laravel backend through server-driven routing rather than a conventional REST API, and a cross-platform Flutter mobile application, which communicates with the backend through a dedicated RESTful JSON API. The application layer, built using the Laravel framework, handles core business logic such as authentication, product and inventory management, order processing, and business reporting, alongside three intelligent modules: a rule-based Product Recommendation module, a trend-based Predictive Analytics module, and a Chatbot Orchestration module that retrieves relevant data from the database before generating natural-language responses through the Google Gemini 2.5 Flash API via the Laravel AI SDK. The data layer consists of a MySQL relational database that stores all persistent system data. This architecture ensures a clear separation of concerns while accommodating the differing communication requirements of the web and mobile clients.</w:t>
+        <w:t>with the Laravel backend through server-driven routing rather than a conventional REST API, and a cross-platform Flutter mobile application, which communicates with the backend through a dedicated RESTful JSON API. The application layer, built using the Laravel framework, handles core business logic such as authentication, product and inventory management, order processing, and business reporting, alongside three intelligent modules: a rule-based Product Recommendation module, a moving-average Predictive Analytics module, and a Chatbot Orchestration module that retrieves relevant data from the database before generating natural-language responses through the Google Gemini 2.5 Flash API via the Laravel AI SDK. The data layer consists of a MySQL relational database that stores all persistent system data. This architecture ensures a clear separation of concerns while accommodating the differing communication requirements of the web and mobile clients.</w:t>
       </w:r>
     </w:p>
     <w:p>
@@ -15570,6 +15543,7 @@
   <w:style w:type="character" w:default="1" w:styleId="DefaultParagraphFont">
     <w:name w:val="Default Paragraph Font"/>
     <w:uiPriority w:val="1"/>
+    <w:semiHidden/>
     <w:unhideWhenUsed/>
   </w:style>
   <w:style w:type="table" w:default="1" w:styleId="TableNormal">
@@ -16022,6 +15996,12 @@
 </file>
 
 <file path=customXml/item1.xml><?xml version="1.0" encoding="utf-8"?>
+<go:gDocsCustomXmlDataStorage xmlns:go="http://customooxmlschemas.google.com/" xmlns:r="http://schemas.openxmlformats.org/officeDocument/2006/relationships" uri="GoogleDocsCustomDataVersion2">
+  <go:docsCustomData xmlns:go="http://customooxmlschemas.google.com/" roundtripDataSignature="AMtx7mhpl8hz/vpkYdq70FPbh3XbTz/Ecw==">CgMxLjAyDmgueG51NjR2Z3llMTMyMg5oLncwdHhqanhwOTRjcTIOaC53a2J0c3Z2bjJ6ZHYyDmguY3IyZTN2emlib3kwMg5oLm1yN2Nwb28yd21qNzIOaC5sNTQ2bDBoeDRwcWM4AHIhMVRxWnVnNmwxWlROSTBYQ3RLZDVaVTdPM3BoZEVndE16</go:docsCustomData>
+</go:gDocsCustomXmlDataStorage>
+</file>
+
+<file path=customXml/item2.xml><?xml version="1.0" encoding="utf-8"?>
 <s:customData xmlns="http://www.wps.cn/officeDocument/2013/wpsCustomData" xmlns:s="http://www.wps.cn/officeDocument/2013/wpsCustomData">
   <customSectProps/>
   <customShpExts>
@@ -16030,25 +16010,19 @@
 </s:customData>
 </file>
 
-<file path=customXml/item2.xml><?xml version="1.0" encoding="utf-8"?>
-<go:gDocsCustomXmlDataStorage xmlns:go="http://customooxmlschemas.google.com/" xmlns:r="http://schemas.openxmlformats.org/officeDocument/2006/relationships" uri="GoogleDocsCustomDataVersion2">
-  <go:docsCustomData xmlns:go="http://customooxmlschemas.google.com/" roundtripDataSignature="AMtx7mhpl8hz/vpkYdq70FPbh3XbTz/Ecw==">CgMxLjAyDmgueG51NjR2Z3llMTMyMg5oLncwdHhqanhwOTRjcTIOaC53a2J0c3Z2bjJ6ZHYyDmguY3IyZTN2emlib3kwMg5oLm1yN2Nwb28yd21qNzIOaC5sNTQ2bDBoeDRwcWM4AHIhMVRxWnVnNmwxWlROSTBYQ3RLZDVaVTdPM3BoZEVndE16</go:docsCustomData>
-</go:gDocsCustomXmlDataStorage>
-</file>
-
 <file path=customXml/itemProps1.xml><?xml version="1.0" encoding="utf-8"?>
-<ds:datastoreItem xmlns:ds="http://schemas.openxmlformats.org/officeDocument/2006/customXml" ds:itemID="{B1977F7D-205B-4081-913C-38D41E755F92}">
-  <ds:schemaRefs>
-    <ds:schemaRef ds:uri="http://www.wps.cn/officeDocument/2013/wpsCustomData"/>
-  </ds:schemaRefs>
-</ds:datastoreItem>
-</file>
-
-<file path=customXml/itemProps2.xml><?xml version="1.0" encoding="utf-8"?>
 <ds:datastoreItem xmlns:ds="http://schemas.openxmlformats.org/officeDocument/2006/customXml" ds:itemID="{11111111-1234-1234-1234-123412341234}">
   <ds:schemaRefs>
     <ds:schemaRef ds:uri="http://customooxmlschemas.google.com/"/>
     <ds:schemaRef ds:uri="http://schemas.openxmlformats.org/officeDocument/2006/relationships"/>
   </ds:schemaRefs>
 </ds:datastoreItem>
+</file>
+
+<file path=customXml/itemProps2.xml><?xml version="1.0" encoding="utf-8"?>
+<ds:datastoreItem xmlns:ds="http://schemas.openxmlformats.org/officeDocument/2006/customXml" ds:itemID="{B1977F7D-205B-4081-913C-38D41E755F92}">
+  <ds:schemaRefs>
+    <ds:schemaRef ds:uri="http://www.wps.cn/officeDocument/2013/wpsCustomData"/>
+  </ds:schemaRefs>
+</ds:datastoreItem>
 </file>
</xml_diff>

<commit_message>
chore: integrate Graphify for codebase analysis and knowledge graph visualization and skill for implementation paymongo
</commit_message>
<xml_diff>
--- a/docs/capstone_manuscript.docx
+++ b/docs/capstone_manuscript.docx
@@ -1752,7 +1752,7 @@
           <w:sz w:val="24"/>
           <w:szCs w:val="24"/>
         </w:rPr>
-        <w:t xml:space="preserve">The product recommendation module relies on the product catalog and inventory data available within the system and does not retrieve real-time pricing or availability from external supplier databases or competitor markets. The predictive analytics and sales forecasting functions use only covered historical unit sales provided by Battlefront Computer Trading, with current inventory as separate planning context, and do not incorporate external market trends, seasonal economic factors, or supplier-side disruptions. Additive Holt–Winters is a decision-support estimate based on recorded sales; it does not estimate unrecorded demand or stockout losses. Its accuracy for Battlefront must be evaluated using real historical sales and is not established by synthetic development data. The chatbot operates within a predefined knowledge base and natural language scope limited to product inquiries, order tracking, store details, and frequently asked questions; it does not support open-domain conversations, complex complaint resolution, or product recommendations, which are handled by the Product Recommendation Module. The mobile application is primarily designed for customer-facing e-commerce functions, while administrative functions requiring complex data entry, bulk inventory uploads, and detailed report generation are optimized for the web-based platform. The study is limited to Battlefront </w:t>
+        <w:t xml:space="preserve">The product recommendation module relies on the product catalog and inventory data available within the system and does not retrieve real-time pricing or availability from external supplier databases or competitor markets. The predictive analytics and sales forecasting functions use only covered historical unit sales provided by Battlefront Computer Trading, with current inventory as separate planning context, and do not incorporate external market trends, seasonal economic factors, or supplier-side disruptions. Additive Holt–Winters is a decision-support estimate based on recorded sales; it does not estimate unrecorded demand or stockout losses. Its accuracy for Battlefront must be evaluated using real historical sales and is not established by synthetic development data. The chatbot operates within a predefined knowledge base and natural language scope limited to product inquiries, order tracking, store details, and frequently asked questions; it does not support open-domain conversations, complex complaint resolution, or product recommendations, which are handled by the Product Recommendation Module. The mobile application is primarily designed for customer-facing e-commerce functions, while administrative functions requiring complex data entry, bulk inventory uploads, and detailed report generation are optimized for the web-based platform. The study is limited to Battlefront Computer Trading, with primary requirements gathering, testing, and evaluation conducted at the Sagay City branch; branch-specific operational customization and multi-branch inventory synchronization are beyond the scope of the study. The system will integrate PayMongo Hosted Checkout for online card, GCash, Maya, and QR Ph payments for pickup and delivery. Direct Online Banking through the PayMongo Payment Intent redirect flow is included for eligible banks, subject to test availability and merchant activation. Completed online payments will be confirmed automatically from authenticated PayMongo evidence; customers will not upload payment receipts. This will replace manual GCash/Maya proof upload and review for new online orders while preserving historical payment records; cash at pickup, physical card-at-store, and COD will remain separate workflows. Payment status will remain distinct from order and fulfillment status. Other payment gateways, automated refunds, saved payment methods, recurring billing, and live production rollout are excluded unless separately approved. Production credentials and transactions require separate approval. Finally, while the system supports order placement, order monitoring, and order status tracking, logistics management, courier integration, route optimization, and real-time delivery tracking remain outside the scope of the study and will continue to depend on the business's existing delivery processes.</w:t>
       </w:r>
       <w:r>
         <w:rPr>
@@ -1761,7 +1761,8 @@
           <w:szCs w:val="24"/>
         </w:rPr>
         <w:lastRenderedPageBreak/>
-        <w:t>Computer Trading, with primary requirements gathering, testing, and evaluation conducted at the Sagay City branch; branch-specific operational customization and multi-branch inventory synchronization are beyond the scope of the study. Real-time online payment gateway integration and automated payment verification, including credit card processing and third-party e-wallet services, are also beyond the scope of the study, with the system supporting payment method selection and manual payment verification procedures determined by Battlefront Computer Trading. Finally, while the system supports order placement, order monitoring, and order status tracking, logistics management, courier integration, route optimization, and real-time delivery tracking remain outside the scope of the study and will continue to depend on the business's existing delivery processes.</w:t>
+        <w:t>
+        </w:t>
       </w:r>
     </w:p>
     <w:p>

</xml_diff>